<commit_message>
feat: Update project files and improve chatbot functionality
- Add .claude/ to .gitignore to exclude specific directory from version control.
- Modify dataset_training.json to refine output messages for clarity.
- Revise PMB.docx to enhance formatting and ensure consistency in information presentation.
- Update Modelfile to improve template handling for chatbot responses.
- Change check.py to display all stored chunks for better debugging.
- Remove conversation.py as it is no longer needed for chat history management.
- Rename ingest.py to rag_ingest.py and improve text chunking logic.
- Enhance query.py to include highlighted lines for better context retrieval and refine response generation.
- Update webhook app.py and tele.py to simplify user ID handling in message processing.
</commit_message>
<xml_diff>
--- a/documents/PMB.docx
+++ b/documents/PMB.docx
@@ -1,20 +1,20 @@
 
 <file path=word/document.xml><?xml version="1.0" encoding="utf-8"?>
-<w:document xmlns:wpc="http://schemas.microsoft.com/office/word/2010/wordprocessingCanvas" xmlns:cx="http://schemas.microsoft.com/office/drawing/2014/chartex" xmlns:cx1="http://schemas.microsoft.com/office/drawing/2015/9/8/chartex" xmlns:cx2="http://schemas.microsoft.com/office/drawing/2015/10/21/chartex" xmlns:cx3="http://schemas.microsoft.com/office/drawing/2016/5/9/chartex" xmlns:cx4="http://schemas.microsoft.com/office/drawing/2016/5/10/chartex" xmlns:cx5="http://schemas.microsoft.com/office/drawing/2016/5/11/chartex" xmlns:cx6="http://schemas.microsoft.com/office/drawing/2016/5/12/chartex" xmlns:cx7="http://schemas.microsoft.com/office/drawing/2016/5/13/chartex" xmlns:cx8="http://schemas.microsoft.com/office/drawing/2016/5/14/chartex" xmlns:mc="http://schemas.openxmlformats.org/markup-compatibility/2006" xmlns:aink="http://schemas.microsoft.com/office/drawing/2016/ink" xmlns:am3d="http://schemas.microsoft.com/office/drawing/2017/model3d" xmlns:o="urn:schemas-microsoft-com:office:office" xmlns:r="http://schemas.openxmlformats.org/officeDocument/2006/relationships" xmlns:m="http://schemas.openxmlformats.org/officeDocument/2006/math" xmlns:v="urn:schemas-microsoft-com:vml" xmlns:wp14="http://schemas.microsoft.com/office/word/2010/wordprocessingDrawing" xmlns:wp="http://schemas.openxmlformats.org/drawingml/2006/wordprocessingDrawing" xmlns:w10="urn:schemas-microsoft-com:office:word" xmlns:w="http://schemas.openxmlformats.org/wordprocessingml/2006/main" xmlns:w14="http://schemas.microsoft.com/office/word/2010/wordml" xmlns:w15="http://schemas.microsoft.com/office/word/2012/wordml" xmlns:w16cex="http://schemas.microsoft.com/office/word/2018/wordml/cex" xmlns:w16cid="http://schemas.microsoft.com/office/word/2016/wordml/cid" xmlns:w16="http://schemas.microsoft.com/office/word/2018/wordml" xmlns:w16sdtdh="http://schemas.microsoft.com/office/word/2020/wordml/sdtdatahash" xmlns:w16se="http://schemas.microsoft.com/office/word/2015/wordml/symex" xmlns:wpg="http://schemas.microsoft.com/office/word/2010/wordprocessingGroup" xmlns:wpi="http://schemas.microsoft.com/office/word/2010/wordprocessingInk" xmlns:wne="http://schemas.microsoft.com/office/word/2006/wordml" xmlns:wps="http://schemas.microsoft.com/office/word/2010/wordprocessingShape" mc:Ignorable="w14 w15 w16se w16cid w16 w16cex w16sdtdh wp14">
+<w:document xmlns:wpc="http://schemas.microsoft.com/office/word/2010/wordprocessingCanvas" xmlns:mc="http://schemas.openxmlformats.org/markup-compatibility/2006" xmlns:o="urn:schemas-microsoft-com:office:office" xmlns:r="http://schemas.openxmlformats.org/officeDocument/2006/relationships" xmlns:m="http://schemas.openxmlformats.org/officeDocument/2006/math" xmlns:v="urn:schemas-microsoft-com:vml" xmlns:wp14="http://schemas.microsoft.com/office/word/2010/wordprocessingDrawing" xmlns:wp="http://schemas.openxmlformats.org/drawingml/2006/wordprocessingDrawing" xmlns:w10="urn:schemas-microsoft-com:office:word" xmlns:w="http://schemas.openxmlformats.org/wordprocessingml/2006/main" xmlns:w14="http://schemas.microsoft.com/office/word/2010/wordml" xmlns:w15="http://schemas.microsoft.com/office/word/2012/wordml" xmlns:w16se="http://schemas.microsoft.com/office/word/2015/wordml/symex" xmlns:w16cid="http://schemas.microsoft.com/office/word/2016/wordml/cid" xmlns:w16="http://schemas.microsoft.com/office/word/2018/wordml" xmlns:w16cex="http://schemas.microsoft.com/office/word/2018/wordml/cex" xmlns:w16sdtdh="http://schemas.microsoft.com/office/word/2020/wordml/sdtdatahash" xmlns:wne="http://schemas.microsoft.com/office/word/2006/wordml" xmlns:wpg="http://schemas.microsoft.com/office/word/2010/wordprocessingGroup" xmlns:wps="http://schemas.microsoft.com/office/word/2010/wordprocessingShape" mc:Ignorable="w14 w15 w16se w16cid w16 w16cex w16sdtdh wp14">
   <w:body>
     <w:p>
       <w:pPr>
         <w:spacing w:after="0" w:line="240" w:lineRule="auto"/>
         <w:jc w:val="both"/>
         <w:rPr>
-          <w:rFonts w:ascii="Times New Roman" w:eastAsia="Times New Roman" w:hAnsi="Times New Roman" w:cs="Times New Roman"/>
-          <w:sz w:val="24"/>
-          <w:szCs w:val="24"/>
-        </w:rPr>
-      </w:pPr>
-      <w:r>
-        <w:rPr>
-          <w:rFonts w:ascii="Times New Roman" w:eastAsia="Times New Roman" w:hAnsi="Times New Roman" w:cs="Times New Roman"/>
+          <w:rFonts w:ascii="Times New Roman" w:hAnsi="Times New Roman" w:eastAsia="Times New Roman" w:cs="Times New Roman"/>
+          <w:sz w:val="24"/>
+          <w:szCs w:val="24"/>
+        </w:rPr>
+      </w:pPr>
+      <w:r>
+        <w:rPr>
+          <w:rFonts w:ascii="Times New Roman" w:hAnsi="Times New Roman" w:eastAsia="Times New Roman" w:cs="Times New Roman"/>
           <w:b/>
           <w:bCs/>
           <w:sz w:val="24"/>
@@ -24,7 +24,7 @@
       </w:r>
       <w:r>
         <w:rPr>
-          <w:rFonts w:ascii="Times New Roman" w:eastAsia="Times New Roman" w:hAnsi="Times New Roman" w:cs="Times New Roman"/>
+          <w:rFonts w:ascii="Times New Roman" w:hAnsi="Times New Roman" w:eastAsia="Times New Roman" w:cs="Times New Roman"/>
           <w:b/>
           <w:bCs/>
           <w:sz w:val="24"/>
@@ -34,7 +34,7 @@
       </w:r>
       <w:r>
         <w:rPr>
-          <w:rFonts w:ascii="Times New Roman" w:eastAsia="Times New Roman" w:hAnsi="Times New Roman" w:cs="Times New Roman"/>
+          <w:rFonts w:ascii="Times New Roman" w:hAnsi="Times New Roman" w:eastAsia="Times New Roman" w:cs="Times New Roman"/>
           <w:b/>
           <w:bCs/>
           <w:sz w:val="24"/>
@@ -50,17 +50,26 @@
           <w:ilvl w:val="0"/>
           <w:numId w:val="13"/>
         </w:numPr>
-        <w:spacing w:before="0" w:beforeAutospacing="0" w:after="0" w:afterAutospacing="0"/>
-        <w:jc w:val="both"/>
-      </w:pPr>
-      <w:r>
-        <w:rPr>
+        <w:spacing w:before="0" w:after="0"/>
+        <w:ind w:left="720" w:hanging="360"/>
+        <w:jc w:val="both"/>
+      </w:pPr>
+      <w:r>
+        <w:rPr>
+          <w:rFonts w:ascii="Times New Roman" w:hAnsi="Times New Roman" w:eastAsia="Times New Roman" w:cs="Times New Roman"/>
           <w:b/>
           <w:bCs/>
+          <w:sz w:val="24"/>
+          <w:szCs w:val="24"/>
         </w:rPr>
         <w:t>Penerimaan Mahasiswa Baru Gelombang I:</w:t>
       </w:r>
       <w:r>
+        <w:rPr>
+          <w:rFonts w:ascii="Times New Roman" w:hAnsi="Times New Roman" w:eastAsia="Times New Roman" w:cs="Times New Roman"/>
+          <w:sz w:val="24"/>
+          <w:szCs w:val="24"/>
+        </w:rPr>
         <w:t xml:space="preserve"> 03 Februari - 11 Mei 2025</w:t>
       </w:r>
     </w:p>
@@ -71,10 +80,16 @@
           <w:ilvl w:val="1"/>
           <w:numId w:val="13"/>
         </w:numPr>
-        <w:spacing w:before="0" w:beforeAutospacing="0" w:after="0" w:afterAutospacing="0"/>
-        <w:jc w:val="both"/>
-      </w:pPr>
-      <w:r>
+        <w:spacing w:before="0" w:after="0"/>
+        <w:ind w:left="1440" w:hanging="360"/>
+        <w:jc w:val="both"/>
+      </w:pPr>
+      <w:r>
+        <w:rPr>
+          <w:rFonts w:ascii="Times New Roman" w:hAnsi="Times New Roman" w:eastAsia="Times New Roman" w:cs="Times New Roman"/>
+          <w:sz w:val="24"/>
+          <w:szCs w:val="24"/>
+        </w:rPr>
         <w:t xml:space="preserve">Seleksi Penerimaan Mahasiswa Baru: 13-14 Mei 2025 </w:t>
       </w:r>
     </w:p>
@@ -85,10 +100,16 @@
           <w:ilvl w:val="1"/>
           <w:numId w:val="13"/>
         </w:numPr>
-        <w:spacing w:before="0" w:beforeAutospacing="0" w:after="0" w:afterAutospacing="0"/>
-        <w:jc w:val="both"/>
-      </w:pPr>
-      <w:r>
+        <w:spacing w:before="0" w:after="0"/>
+        <w:ind w:left="1440" w:hanging="360"/>
+        <w:jc w:val="both"/>
+      </w:pPr>
+      <w:r>
+        <w:rPr>
+          <w:rFonts w:ascii="Times New Roman" w:hAnsi="Times New Roman" w:eastAsia="Times New Roman" w:cs="Times New Roman"/>
+          <w:sz w:val="24"/>
+          <w:szCs w:val="24"/>
+        </w:rPr>
         <w:t xml:space="preserve">Pengumuman Hasil Seleksi: 17 Mei 2025 </w:t>
       </w:r>
     </w:p>
@@ -99,10 +120,16 @@
           <w:ilvl w:val="1"/>
           <w:numId w:val="13"/>
         </w:numPr>
-        <w:spacing w:before="0" w:beforeAutospacing="0" w:after="0" w:afterAutospacing="0"/>
-        <w:jc w:val="both"/>
-      </w:pPr>
-      <w:r>
+        <w:spacing w:before="0" w:after="0"/>
+        <w:ind w:left="1440" w:hanging="360"/>
+        <w:jc w:val="both"/>
+      </w:pPr>
+      <w:r>
+        <w:rPr>
+          <w:rFonts w:ascii="Times New Roman" w:hAnsi="Times New Roman" w:eastAsia="Times New Roman" w:cs="Times New Roman"/>
+          <w:sz w:val="24"/>
+          <w:szCs w:val="24"/>
+        </w:rPr>
         <w:t xml:space="preserve">Registrasi Administrasi Mahasiswa Baru: 19-24 Mei 2025 </w:t>
       </w:r>
     </w:p>
@@ -113,24 +140,36 @@
           <w:ilvl w:val="0"/>
           <w:numId w:val="13"/>
         </w:numPr>
-        <w:spacing w:before="0" w:beforeAutospacing="0" w:after="0" w:afterAutospacing="0"/>
-        <w:jc w:val="both"/>
-      </w:pPr>
-      <w:r>
-        <w:rPr>
+        <w:spacing w:before="0" w:after="0"/>
+        <w:ind w:left="720" w:hanging="360"/>
+        <w:jc w:val="both"/>
+      </w:pPr>
+      <w:r>
+        <w:rPr>
+          <w:rFonts w:ascii="Times New Roman" w:hAnsi="Times New Roman" w:eastAsia="Times New Roman" w:cs="Times New Roman"/>
           <w:b/>
           <w:bCs/>
+          <w:sz w:val="24"/>
+          <w:szCs w:val="24"/>
         </w:rPr>
         <w:t>Penerimaan Mahasiswa Baru Gelombang II:</w:t>
       </w:r>
       <w:r>
         <w:rPr>
+          <w:rFonts w:ascii="Times New Roman" w:hAnsi="Times New Roman" w:eastAsia="Times New Roman" w:cs="Times New Roman"/>
           <w:b/>
           <w:bCs/>
+          <w:sz w:val="24"/>
+          <w:szCs w:val="24"/>
         </w:rPr>
         <w:t xml:space="preserve"> </w:t>
       </w:r>
       <w:r>
+        <w:rPr>
+          <w:rFonts w:ascii="Times New Roman" w:hAnsi="Times New Roman" w:eastAsia="Times New Roman" w:cs="Times New Roman"/>
+          <w:sz w:val="24"/>
+          <w:szCs w:val="24"/>
+        </w:rPr>
         <w:t xml:space="preserve">12 Mei - 19 Juli 2026 </w:t>
       </w:r>
     </w:p>
@@ -141,10 +180,16 @@
           <w:ilvl w:val="1"/>
           <w:numId w:val="13"/>
         </w:numPr>
-        <w:spacing w:before="0" w:beforeAutospacing="0" w:after="0" w:afterAutospacing="0"/>
-        <w:jc w:val="both"/>
-      </w:pPr>
-      <w:r>
+        <w:spacing w:before="0" w:after="0"/>
+        <w:ind w:left="1440" w:hanging="360"/>
+        <w:jc w:val="both"/>
+      </w:pPr>
+      <w:r>
+        <w:rPr>
+          <w:rFonts w:ascii="Times New Roman" w:hAnsi="Times New Roman" w:eastAsia="Times New Roman" w:cs="Times New Roman"/>
+          <w:sz w:val="24"/>
+          <w:szCs w:val="24"/>
+        </w:rPr>
         <w:t xml:space="preserve">Seleksi Penerimaan Mahasiswa Baru: 22-23 Juli 2026 </w:t>
       </w:r>
     </w:p>
@@ -155,10 +200,16 @@
           <w:ilvl w:val="1"/>
           <w:numId w:val="13"/>
         </w:numPr>
-        <w:spacing w:before="0" w:beforeAutospacing="0" w:after="0" w:afterAutospacing="0"/>
-        <w:jc w:val="both"/>
-      </w:pPr>
-      <w:r>
+        <w:spacing w:before="0" w:after="0"/>
+        <w:ind w:left="1440" w:hanging="360"/>
+        <w:jc w:val="both"/>
+      </w:pPr>
+      <w:r>
+        <w:rPr>
+          <w:rFonts w:ascii="Times New Roman" w:hAnsi="Times New Roman" w:eastAsia="Times New Roman" w:cs="Times New Roman"/>
+          <w:sz w:val="24"/>
+          <w:szCs w:val="24"/>
+        </w:rPr>
         <w:t xml:space="preserve">Pengumuman Hasil Seleksi: 26 Juli 2025 </w:t>
       </w:r>
     </w:p>
@@ -169,10 +220,16 @@
           <w:ilvl w:val="1"/>
           <w:numId w:val="13"/>
         </w:numPr>
-        <w:spacing w:before="0" w:beforeAutospacing="0" w:after="0" w:afterAutospacing="0"/>
-        <w:jc w:val="both"/>
-      </w:pPr>
-      <w:r>
+        <w:spacing w:before="0" w:after="0"/>
+        <w:ind w:left="1440" w:hanging="360"/>
+        <w:jc w:val="both"/>
+      </w:pPr>
+      <w:r>
+        <w:rPr>
+          <w:rFonts w:ascii="Times New Roman" w:hAnsi="Times New Roman" w:eastAsia="Times New Roman" w:cs="Times New Roman"/>
+          <w:sz w:val="24"/>
+          <w:szCs w:val="24"/>
+        </w:rPr>
         <w:t xml:space="preserve">Registrasi Administrasi Mahasiswa Baru: 28 Juli - 2 Agustus 2025 </w:t>
       </w:r>
     </w:p>
@@ -183,17 +240,26 @@
           <w:ilvl w:val="0"/>
           <w:numId w:val="13"/>
         </w:numPr>
-        <w:spacing w:before="0" w:beforeAutospacing="0" w:after="0" w:afterAutospacing="0"/>
-        <w:jc w:val="both"/>
-      </w:pPr>
-      <w:r>
-        <w:rPr>
+        <w:spacing w:before="0" w:after="0"/>
+        <w:ind w:left="720" w:hanging="360"/>
+        <w:jc w:val="both"/>
+      </w:pPr>
+      <w:r>
+        <w:rPr>
+          <w:rFonts w:ascii="Times New Roman" w:hAnsi="Times New Roman" w:eastAsia="Times New Roman" w:cs="Times New Roman"/>
           <w:b/>
           <w:bCs/>
+          <w:sz w:val="24"/>
+          <w:szCs w:val="24"/>
         </w:rPr>
         <w:t>Penerimaan Mahasiswa Baru Gelombang III:</w:t>
       </w:r>
       <w:r>
+        <w:rPr>
+          <w:rFonts w:ascii="Times New Roman" w:hAnsi="Times New Roman" w:eastAsia="Times New Roman" w:cs="Times New Roman"/>
+          <w:sz w:val="24"/>
+          <w:szCs w:val="24"/>
+        </w:rPr>
         <w:t xml:space="preserve"> 21 Juli - 16 Agustus 2025 </w:t>
       </w:r>
     </w:p>
@@ -204,10 +270,16 @@
           <w:ilvl w:val="1"/>
           <w:numId w:val="13"/>
         </w:numPr>
-        <w:spacing w:before="0" w:beforeAutospacing="0" w:after="0" w:afterAutospacing="0"/>
-        <w:jc w:val="both"/>
-      </w:pPr>
-      <w:r>
+        <w:spacing w:before="0" w:after="0"/>
+        <w:ind w:left="1440" w:hanging="360"/>
+        <w:jc w:val="both"/>
+      </w:pPr>
+      <w:r>
+        <w:rPr>
+          <w:rFonts w:ascii="Times New Roman" w:hAnsi="Times New Roman" w:eastAsia="Times New Roman" w:cs="Times New Roman"/>
+          <w:sz w:val="24"/>
+          <w:szCs w:val="24"/>
+        </w:rPr>
         <w:t xml:space="preserve">Seleksi Penerimaan Mahasiswa Baru: 19-20 Agustus 2025 </w:t>
       </w:r>
     </w:p>
@@ -218,10 +290,16 @@
           <w:ilvl w:val="1"/>
           <w:numId w:val="13"/>
         </w:numPr>
-        <w:spacing w:before="0" w:beforeAutospacing="0" w:after="0" w:afterAutospacing="0"/>
-        <w:jc w:val="both"/>
-      </w:pPr>
-      <w:r>
+        <w:spacing w:before="0" w:after="0"/>
+        <w:ind w:left="1440" w:hanging="360"/>
+        <w:jc w:val="both"/>
+      </w:pPr>
+      <w:r>
+        <w:rPr>
+          <w:rFonts w:ascii="Times New Roman" w:hAnsi="Times New Roman" w:eastAsia="Times New Roman" w:cs="Times New Roman"/>
+          <w:sz w:val="24"/>
+          <w:szCs w:val="24"/>
+        </w:rPr>
         <w:t xml:space="preserve">Pengumuman Hasil Seleksi: 23 Agustus 2025 </w:t>
       </w:r>
     </w:p>
@@ -232,10 +310,16 @@
           <w:ilvl w:val="1"/>
           <w:numId w:val="13"/>
         </w:numPr>
-        <w:spacing w:before="0" w:beforeAutospacing="0" w:after="0" w:afterAutospacing="0"/>
-        <w:jc w:val="both"/>
-      </w:pPr>
-      <w:r>
+        <w:spacing w:before="0" w:after="0"/>
+        <w:ind w:left="1440" w:hanging="360"/>
+        <w:jc w:val="both"/>
+      </w:pPr>
+      <w:r>
+        <w:rPr>
+          <w:rFonts w:ascii="Times New Roman" w:hAnsi="Times New Roman" w:eastAsia="Times New Roman" w:cs="Times New Roman"/>
+          <w:sz w:val="24"/>
+          <w:szCs w:val="24"/>
+        </w:rPr>
         <w:t xml:space="preserve">Registrasi Administrasi Mahasiswa Baru: 25-30 Agustus 2025 </w:t>
       </w:r>
     </w:p>
@@ -245,25 +329,25 @@
         <w:ind w:left="720"/>
         <w:jc w:val="both"/>
         <w:rPr>
-          <w:rFonts w:ascii="Times New Roman" w:eastAsia="Times New Roman" w:hAnsi="Times New Roman" w:cs="Times New Roman"/>
-          <w:sz w:val="24"/>
-          <w:szCs w:val="24"/>
-        </w:rPr>
-      </w:pPr>
-    </w:p>
-    <w:p>
-      <w:pPr>
-        <w:spacing w:after="0" w:line="240" w:lineRule="auto"/>
-        <w:jc w:val="both"/>
-        <w:rPr>
-          <w:rFonts w:ascii="Times New Roman" w:eastAsia="Times New Roman" w:hAnsi="Times New Roman" w:cs="Times New Roman"/>
-          <w:sz w:val="24"/>
-          <w:szCs w:val="24"/>
-        </w:rPr>
-      </w:pPr>
-      <w:r>
-        <w:rPr>
-          <w:rFonts w:ascii="Times New Roman" w:eastAsia="Times New Roman" w:hAnsi="Times New Roman" w:cs="Times New Roman"/>
+          <w:rFonts w:ascii="Times New Roman" w:hAnsi="Times New Roman" w:eastAsia="Times New Roman" w:cs="Times New Roman"/>
+          <w:sz w:val="24"/>
+          <w:szCs w:val="24"/>
+        </w:rPr>
+      </w:pPr>
+    </w:p>
+    <w:p>
+      <w:pPr>
+        <w:spacing w:after="0" w:line="240" w:lineRule="auto"/>
+        <w:jc w:val="both"/>
+        <w:rPr>
+          <w:rFonts w:ascii="Times New Roman" w:hAnsi="Times New Roman" w:eastAsia="Times New Roman" w:cs="Times New Roman"/>
+          <w:sz w:val="24"/>
+          <w:szCs w:val="24"/>
+        </w:rPr>
+      </w:pPr>
+      <w:r>
+        <w:rPr>
+          <w:rFonts w:ascii="Times New Roman" w:hAnsi="Times New Roman" w:eastAsia="Times New Roman" w:cs="Times New Roman"/>
           <w:b/>
           <w:bCs/>
           <w:sz w:val="24"/>
@@ -273,7 +357,7 @@
       </w:r>
       <w:r>
         <w:rPr>
-          <w:rFonts w:ascii="Times New Roman" w:eastAsia="Times New Roman" w:hAnsi="Times New Roman" w:cs="Times New Roman"/>
+          <w:rFonts w:ascii="Times New Roman" w:hAnsi="Times New Roman" w:eastAsia="Times New Roman" w:cs="Times New Roman"/>
           <w:b/>
           <w:bCs/>
           <w:sz w:val="24"/>
@@ -289,16 +373,17 @@
           <w:numId w:val="2"/>
         </w:numPr>
         <w:spacing w:after="0" w:line="240" w:lineRule="auto"/>
-        <w:jc w:val="both"/>
-        <w:rPr>
-          <w:rFonts w:ascii="Times New Roman" w:eastAsia="Times New Roman" w:hAnsi="Times New Roman" w:cs="Times New Roman"/>
-          <w:sz w:val="24"/>
-          <w:szCs w:val="24"/>
-        </w:rPr>
-      </w:pPr>
-      <w:r>
-        <w:rPr>
-          <w:rFonts w:ascii="Times New Roman" w:eastAsia="Times New Roman" w:hAnsi="Times New Roman" w:cs="Times New Roman"/>
+        <w:ind w:left="720" w:hanging="360"/>
+        <w:jc w:val="both"/>
+        <w:rPr>
+          <w:rFonts w:ascii="Times New Roman" w:hAnsi="Times New Roman" w:eastAsia="Times New Roman" w:cs="Times New Roman"/>
+          <w:sz w:val="24"/>
+          <w:szCs w:val="24"/>
+        </w:rPr>
+      </w:pPr>
+      <w:r>
+        <w:rPr>
+          <w:rFonts w:ascii="Times New Roman" w:hAnsi="Times New Roman" w:eastAsia="Times New Roman" w:cs="Times New Roman"/>
           <w:sz w:val="24"/>
           <w:szCs w:val="24"/>
         </w:rPr>
@@ -312,16 +397,17 @@
           <w:numId w:val="2"/>
         </w:numPr>
         <w:spacing w:after="0" w:line="240" w:lineRule="auto"/>
-        <w:jc w:val="both"/>
-        <w:rPr>
-          <w:rFonts w:ascii="Times New Roman" w:eastAsia="Times New Roman" w:hAnsi="Times New Roman" w:cs="Times New Roman"/>
-          <w:sz w:val="24"/>
-          <w:szCs w:val="24"/>
-        </w:rPr>
-      </w:pPr>
-      <w:r>
-        <w:rPr>
-          <w:rFonts w:ascii="Times New Roman" w:eastAsia="Times New Roman" w:hAnsi="Times New Roman" w:cs="Times New Roman"/>
+        <w:ind w:left="720" w:hanging="360"/>
+        <w:jc w:val="both"/>
+        <w:rPr>
+          <w:rFonts w:ascii="Times New Roman" w:hAnsi="Times New Roman" w:eastAsia="Times New Roman" w:cs="Times New Roman"/>
+          <w:sz w:val="24"/>
+          <w:szCs w:val="24"/>
+        </w:rPr>
+      </w:pPr>
+      <w:r>
+        <w:rPr>
+          <w:rFonts w:ascii="Times New Roman" w:hAnsi="Times New Roman" w:eastAsia="Times New Roman" w:cs="Times New Roman"/>
           <w:sz w:val="24"/>
           <w:szCs w:val="24"/>
         </w:rPr>
@@ -335,16 +421,17 @@
           <w:numId w:val="2"/>
         </w:numPr>
         <w:spacing w:after="0" w:line="240" w:lineRule="auto"/>
-        <w:jc w:val="both"/>
-        <w:rPr>
-          <w:rFonts w:ascii="Times New Roman" w:eastAsia="Times New Roman" w:hAnsi="Times New Roman" w:cs="Times New Roman"/>
-          <w:sz w:val="24"/>
-          <w:szCs w:val="24"/>
-        </w:rPr>
-      </w:pPr>
-      <w:r>
-        <w:rPr>
-          <w:rFonts w:ascii="Times New Roman" w:eastAsia="Times New Roman" w:hAnsi="Times New Roman" w:cs="Times New Roman"/>
+        <w:ind w:left="720" w:hanging="360"/>
+        <w:jc w:val="both"/>
+        <w:rPr>
+          <w:rFonts w:ascii="Times New Roman" w:hAnsi="Times New Roman" w:eastAsia="Times New Roman" w:cs="Times New Roman"/>
+          <w:sz w:val="24"/>
+          <w:szCs w:val="24"/>
+        </w:rPr>
+      </w:pPr>
+      <w:r>
+        <w:rPr>
+          <w:rFonts w:ascii="Times New Roman" w:hAnsi="Times New Roman" w:eastAsia="Times New Roman" w:cs="Times New Roman"/>
           <w:sz w:val="24"/>
           <w:szCs w:val="24"/>
         </w:rPr>
@@ -358,16 +445,17 @@
           <w:numId w:val="2"/>
         </w:numPr>
         <w:spacing w:after="0" w:line="240" w:lineRule="auto"/>
-        <w:jc w:val="both"/>
-        <w:rPr>
-          <w:rFonts w:ascii="Times New Roman" w:eastAsia="Times New Roman" w:hAnsi="Times New Roman" w:cs="Times New Roman"/>
-          <w:sz w:val="24"/>
-          <w:szCs w:val="24"/>
-        </w:rPr>
-      </w:pPr>
-      <w:r>
-        <w:rPr>
-          <w:rFonts w:ascii="Times New Roman" w:eastAsia="Times New Roman" w:hAnsi="Times New Roman" w:cs="Times New Roman"/>
+        <w:ind w:left="720" w:hanging="360"/>
+        <w:jc w:val="both"/>
+        <w:rPr>
+          <w:rFonts w:ascii="Times New Roman" w:hAnsi="Times New Roman" w:eastAsia="Times New Roman" w:cs="Times New Roman"/>
+          <w:sz w:val="24"/>
+          <w:szCs w:val="24"/>
+        </w:rPr>
+      </w:pPr>
+      <w:r>
+        <w:rPr>
+          <w:rFonts w:ascii="Times New Roman" w:hAnsi="Times New Roman" w:eastAsia="Times New Roman" w:cs="Times New Roman"/>
           <w:sz w:val="24"/>
           <w:szCs w:val="24"/>
         </w:rPr>
@@ -381,16 +469,17 @@
           <w:numId w:val="2"/>
         </w:numPr>
         <w:spacing w:after="0" w:line="240" w:lineRule="auto"/>
-        <w:jc w:val="both"/>
-        <w:rPr>
-          <w:rFonts w:ascii="Times New Roman" w:eastAsia="Times New Roman" w:hAnsi="Times New Roman" w:cs="Times New Roman"/>
-          <w:sz w:val="24"/>
-          <w:szCs w:val="24"/>
-        </w:rPr>
-      </w:pPr>
-      <w:r>
-        <w:rPr>
-          <w:rFonts w:ascii="Times New Roman" w:eastAsia="Times New Roman" w:hAnsi="Times New Roman" w:cs="Times New Roman"/>
+        <w:ind w:left="720" w:hanging="360"/>
+        <w:jc w:val="both"/>
+        <w:rPr>
+          <w:rFonts w:ascii="Times New Roman" w:hAnsi="Times New Roman" w:eastAsia="Times New Roman" w:cs="Times New Roman"/>
+          <w:sz w:val="24"/>
+          <w:szCs w:val="24"/>
+        </w:rPr>
+      </w:pPr>
+      <w:r>
+        <w:rPr>
+          <w:rFonts w:ascii="Times New Roman" w:hAnsi="Times New Roman" w:eastAsia="Times New Roman" w:cs="Times New Roman"/>
           <w:sz w:val="24"/>
           <w:szCs w:val="24"/>
         </w:rPr>
@@ -404,16 +493,17 @@
           <w:numId w:val="2"/>
         </w:numPr>
         <w:spacing w:after="0" w:line="240" w:lineRule="auto"/>
-        <w:jc w:val="both"/>
-        <w:rPr>
-          <w:rFonts w:ascii="Times New Roman" w:eastAsia="Times New Roman" w:hAnsi="Times New Roman" w:cs="Times New Roman"/>
-          <w:sz w:val="24"/>
-          <w:szCs w:val="24"/>
-        </w:rPr>
-      </w:pPr>
-      <w:r>
-        <w:rPr>
-          <w:rFonts w:ascii="Times New Roman" w:eastAsia="Times New Roman" w:hAnsi="Times New Roman" w:cs="Times New Roman"/>
+        <w:ind w:left="720" w:hanging="360"/>
+        <w:jc w:val="both"/>
+        <w:rPr>
+          <w:rFonts w:ascii="Times New Roman" w:hAnsi="Times New Roman" w:eastAsia="Times New Roman" w:cs="Times New Roman"/>
+          <w:sz w:val="24"/>
+          <w:szCs w:val="24"/>
+        </w:rPr>
+      </w:pPr>
+      <w:r>
+        <w:rPr>
+          <w:rFonts w:ascii="Times New Roman" w:hAnsi="Times New Roman" w:eastAsia="Times New Roman" w:cs="Times New Roman"/>
           <w:sz w:val="24"/>
           <w:szCs w:val="24"/>
         </w:rPr>
@@ -427,16 +517,17 @@
           <w:numId w:val="2"/>
         </w:numPr>
         <w:spacing w:after="0" w:line="240" w:lineRule="auto"/>
-        <w:jc w:val="both"/>
-        <w:rPr>
-          <w:rFonts w:ascii="Times New Roman" w:eastAsia="Times New Roman" w:hAnsi="Times New Roman" w:cs="Times New Roman"/>
-          <w:sz w:val="24"/>
-          <w:szCs w:val="24"/>
-        </w:rPr>
-      </w:pPr>
-      <w:r>
-        <w:rPr>
-          <w:rFonts w:ascii="Times New Roman" w:eastAsia="Times New Roman" w:hAnsi="Times New Roman" w:cs="Times New Roman"/>
+        <w:ind w:left="720" w:hanging="360"/>
+        <w:jc w:val="both"/>
+        <w:rPr>
+          <w:rFonts w:ascii="Times New Roman" w:hAnsi="Times New Roman" w:eastAsia="Times New Roman" w:cs="Times New Roman"/>
+          <w:sz w:val="24"/>
+          <w:szCs w:val="24"/>
+        </w:rPr>
+      </w:pPr>
+      <w:r>
+        <w:rPr>
+          <w:rFonts w:ascii="Times New Roman" w:hAnsi="Times New Roman" w:eastAsia="Times New Roman" w:cs="Times New Roman"/>
           <w:sz w:val="24"/>
           <w:szCs w:val="24"/>
         </w:rPr>
@@ -449,25 +540,25 @@
         <w:ind w:left="720"/>
         <w:jc w:val="both"/>
         <w:rPr>
-          <w:rFonts w:ascii="Times New Roman" w:eastAsia="Times New Roman" w:hAnsi="Times New Roman" w:cs="Times New Roman"/>
-          <w:sz w:val="24"/>
-          <w:szCs w:val="24"/>
-        </w:rPr>
-      </w:pPr>
-    </w:p>
-    <w:p>
-      <w:pPr>
-        <w:spacing w:after="0" w:line="240" w:lineRule="auto"/>
-        <w:jc w:val="both"/>
-        <w:rPr>
-          <w:rFonts w:ascii="Times New Roman" w:eastAsia="Times New Roman" w:hAnsi="Times New Roman" w:cs="Times New Roman"/>
-          <w:sz w:val="24"/>
-          <w:szCs w:val="24"/>
-        </w:rPr>
-      </w:pPr>
-      <w:r>
-        <w:rPr>
-          <w:rFonts w:ascii="Times New Roman" w:eastAsia="Times New Roman" w:hAnsi="Times New Roman" w:cs="Times New Roman"/>
+          <w:rFonts w:ascii="Times New Roman" w:hAnsi="Times New Roman" w:eastAsia="Times New Roman" w:cs="Times New Roman"/>
+          <w:sz w:val="24"/>
+          <w:szCs w:val="24"/>
+        </w:rPr>
+      </w:pPr>
+    </w:p>
+    <w:p>
+      <w:pPr>
+        <w:spacing w:after="0" w:line="240" w:lineRule="auto"/>
+        <w:jc w:val="both"/>
+        <w:rPr>
+          <w:rFonts w:ascii="Times New Roman" w:hAnsi="Times New Roman" w:eastAsia="Times New Roman" w:cs="Times New Roman"/>
+          <w:sz w:val="24"/>
+          <w:szCs w:val="24"/>
+        </w:rPr>
+      </w:pPr>
+      <w:r>
+        <w:rPr>
+          <w:rFonts w:ascii="Times New Roman" w:hAnsi="Times New Roman" w:eastAsia="Times New Roman" w:cs="Times New Roman"/>
           <w:b/>
           <w:bCs/>
           <w:sz w:val="24"/>
@@ -483,16 +574,17 @@
           <w:numId w:val="3"/>
         </w:numPr>
         <w:spacing w:after="0" w:line="240" w:lineRule="auto"/>
-        <w:jc w:val="both"/>
-        <w:rPr>
-          <w:rFonts w:ascii="Times New Roman" w:eastAsia="Times New Roman" w:hAnsi="Times New Roman" w:cs="Times New Roman"/>
-          <w:sz w:val="24"/>
-          <w:szCs w:val="24"/>
-        </w:rPr>
-      </w:pPr>
-      <w:r>
-        <w:rPr>
-          <w:rFonts w:ascii="Times New Roman" w:eastAsia="Times New Roman" w:hAnsi="Times New Roman" w:cs="Times New Roman"/>
+        <w:ind w:left="720" w:hanging="360"/>
+        <w:jc w:val="both"/>
+        <w:rPr>
+          <w:rFonts w:ascii="Times New Roman" w:hAnsi="Times New Roman" w:eastAsia="Times New Roman" w:cs="Times New Roman"/>
+          <w:sz w:val="24"/>
+          <w:szCs w:val="24"/>
+        </w:rPr>
+      </w:pPr>
+      <w:r>
+        <w:rPr>
+          <w:rFonts w:ascii="Times New Roman" w:hAnsi="Times New Roman" w:eastAsia="Times New Roman" w:cs="Times New Roman"/>
           <w:sz w:val="24"/>
           <w:szCs w:val="24"/>
         </w:rPr>
@@ -506,16 +598,17 @@
           <w:numId w:val="3"/>
         </w:numPr>
         <w:spacing w:after="0" w:line="240" w:lineRule="auto"/>
-        <w:jc w:val="both"/>
-        <w:rPr>
-          <w:rFonts w:ascii="Times New Roman" w:eastAsia="Times New Roman" w:hAnsi="Times New Roman" w:cs="Times New Roman"/>
-          <w:sz w:val="24"/>
-          <w:szCs w:val="24"/>
-        </w:rPr>
-      </w:pPr>
-      <w:r>
-        <w:rPr>
-          <w:rFonts w:ascii="Times New Roman" w:eastAsia="Times New Roman" w:hAnsi="Times New Roman" w:cs="Times New Roman"/>
+        <w:ind w:left="720" w:hanging="360"/>
+        <w:jc w:val="both"/>
+        <w:rPr>
+          <w:rFonts w:ascii="Times New Roman" w:hAnsi="Times New Roman" w:eastAsia="Times New Roman" w:cs="Times New Roman"/>
+          <w:sz w:val="24"/>
+          <w:szCs w:val="24"/>
+        </w:rPr>
+      </w:pPr>
+      <w:r>
+        <w:rPr>
+          <w:rFonts w:ascii="Times New Roman" w:hAnsi="Times New Roman" w:eastAsia="Times New Roman" w:cs="Times New Roman"/>
           <w:sz w:val="24"/>
           <w:szCs w:val="24"/>
         </w:rPr>
@@ -527,25 +620,25 @@
         <w:spacing w:after="0" w:line="240" w:lineRule="auto"/>
         <w:jc w:val="both"/>
         <w:rPr>
-          <w:rFonts w:ascii="Times New Roman" w:eastAsia="Times New Roman" w:hAnsi="Times New Roman" w:cs="Times New Roman"/>
-          <w:sz w:val="24"/>
-          <w:szCs w:val="24"/>
-        </w:rPr>
-      </w:pPr>
-    </w:p>
-    <w:p>
-      <w:pPr>
-        <w:spacing w:after="0" w:line="240" w:lineRule="auto"/>
-        <w:jc w:val="both"/>
-        <w:rPr>
-          <w:rFonts w:ascii="Times New Roman" w:eastAsia="Times New Roman" w:hAnsi="Times New Roman" w:cs="Times New Roman"/>
-          <w:sz w:val="24"/>
-          <w:szCs w:val="24"/>
-        </w:rPr>
-      </w:pPr>
-      <w:r>
-        <w:rPr>
-          <w:rFonts w:ascii="Times New Roman" w:eastAsia="Times New Roman" w:hAnsi="Times New Roman" w:cs="Times New Roman"/>
+          <w:rFonts w:ascii="Times New Roman" w:hAnsi="Times New Roman" w:eastAsia="Times New Roman" w:cs="Times New Roman"/>
+          <w:sz w:val="24"/>
+          <w:szCs w:val="24"/>
+        </w:rPr>
+      </w:pPr>
+    </w:p>
+    <w:p>
+      <w:pPr>
+        <w:spacing w:after="0" w:line="240" w:lineRule="auto"/>
+        <w:jc w:val="both"/>
+        <w:rPr>
+          <w:rFonts w:ascii="Times New Roman" w:hAnsi="Times New Roman" w:eastAsia="Times New Roman" w:cs="Times New Roman"/>
+          <w:sz w:val="24"/>
+          <w:szCs w:val="24"/>
+        </w:rPr>
+      </w:pPr>
+      <w:r>
+        <w:rPr>
+          <w:rFonts w:ascii="Times New Roman" w:hAnsi="Times New Roman" w:eastAsia="Times New Roman" w:cs="Times New Roman"/>
           <w:b/>
           <w:bCs/>
           <w:sz w:val="24"/>
@@ -555,7 +648,7 @@
       </w:r>
       <w:r>
         <w:rPr>
-          <w:rFonts w:ascii="Times New Roman" w:eastAsia="Times New Roman" w:hAnsi="Times New Roman" w:cs="Times New Roman"/>
+          <w:rFonts w:ascii="Times New Roman" w:hAnsi="Times New Roman" w:eastAsia="Times New Roman" w:cs="Times New Roman"/>
           <w:sz w:val="24"/>
           <w:szCs w:val="24"/>
         </w:rPr>
@@ -568,14 +661,14 @@
         <w:ind w:firstLine="720"/>
         <w:jc w:val="both"/>
         <w:rPr>
-          <w:rFonts w:ascii="Times New Roman" w:eastAsia="Times New Roman" w:hAnsi="Times New Roman" w:cs="Times New Roman"/>
-          <w:sz w:val="24"/>
-          <w:szCs w:val="24"/>
-        </w:rPr>
-      </w:pPr>
-      <w:r>
-        <w:rPr>
-          <w:rFonts w:ascii="Times New Roman" w:eastAsia="Times New Roman" w:hAnsi="Times New Roman" w:cs="Times New Roman"/>
+          <w:rFonts w:ascii="Times New Roman" w:hAnsi="Times New Roman" w:eastAsia="Times New Roman" w:cs="Times New Roman"/>
+          <w:sz w:val="24"/>
+          <w:szCs w:val="24"/>
+        </w:rPr>
+      </w:pPr>
+      <w:r>
+        <w:rPr>
+          <w:rFonts w:ascii="Times New Roman" w:hAnsi="Times New Roman" w:eastAsia="Times New Roman" w:cs="Times New Roman"/>
           <w:sz w:val="24"/>
           <w:szCs w:val="24"/>
         </w:rPr>
@@ -587,25 +680,25 @@
         <w:spacing w:after="0" w:line="240" w:lineRule="auto"/>
         <w:jc w:val="both"/>
         <w:rPr>
-          <w:rFonts w:ascii="Times New Roman" w:eastAsia="Times New Roman" w:hAnsi="Times New Roman" w:cs="Times New Roman"/>
-          <w:sz w:val="24"/>
-          <w:szCs w:val="24"/>
-        </w:rPr>
-      </w:pPr>
-    </w:p>
-    <w:p>
-      <w:pPr>
-        <w:spacing w:after="0" w:line="240" w:lineRule="auto"/>
-        <w:jc w:val="both"/>
-        <w:rPr>
-          <w:rFonts w:ascii="Times New Roman" w:eastAsia="Times New Roman" w:hAnsi="Times New Roman" w:cs="Times New Roman"/>
-          <w:sz w:val="24"/>
-          <w:szCs w:val="24"/>
-        </w:rPr>
-      </w:pPr>
-      <w:r>
-        <w:rPr>
-          <w:rFonts w:ascii="Times New Roman" w:eastAsia="Times New Roman" w:hAnsi="Times New Roman" w:cs="Times New Roman"/>
+          <w:rFonts w:ascii="Times New Roman" w:hAnsi="Times New Roman" w:eastAsia="Times New Roman" w:cs="Times New Roman"/>
+          <w:sz w:val="24"/>
+          <w:szCs w:val="24"/>
+        </w:rPr>
+      </w:pPr>
+    </w:p>
+    <w:p>
+      <w:pPr>
+        <w:spacing w:after="0" w:line="240" w:lineRule="auto"/>
+        <w:jc w:val="both"/>
+        <w:rPr>
+          <w:rFonts w:ascii="Times New Roman" w:hAnsi="Times New Roman" w:eastAsia="Times New Roman" w:cs="Times New Roman"/>
+          <w:sz w:val="24"/>
+          <w:szCs w:val="24"/>
+        </w:rPr>
+      </w:pPr>
+      <w:r>
+        <w:rPr>
+          <w:rFonts w:ascii="Times New Roman" w:hAnsi="Times New Roman" w:eastAsia="Times New Roman" w:cs="Times New Roman"/>
           <w:b/>
           <w:bCs/>
           <w:sz w:val="24"/>
@@ -615,7 +708,7 @@
       </w:r>
       <w:r>
         <w:rPr>
-          <w:rFonts w:ascii="Times New Roman" w:eastAsia="Times New Roman" w:hAnsi="Times New Roman" w:cs="Times New Roman"/>
+          <w:rFonts w:ascii="Times New Roman" w:hAnsi="Times New Roman" w:eastAsia="Times New Roman" w:cs="Times New Roman"/>
           <w:sz w:val="24"/>
           <w:szCs w:val="24"/>
         </w:rPr>
@@ -628,14 +721,14 @@
         <w:ind w:firstLine="720"/>
         <w:jc w:val="both"/>
         <w:rPr>
-          <w:rFonts w:ascii="Times New Roman" w:eastAsia="Times New Roman" w:hAnsi="Times New Roman" w:cs="Times New Roman"/>
-          <w:sz w:val="24"/>
-          <w:szCs w:val="24"/>
-        </w:rPr>
-      </w:pPr>
-      <w:r>
-        <w:rPr>
-          <w:rFonts w:ascii="Times New Roman" w:eastAsia="Times New Roman" w:hAnsi="Times New Roman" w:cs="Times New Roman"/>
+          <w:rFonts w:ascii="Times New Roman" w:hAnsi="Times New Roman" w:eastAsia="Times New Roman" w:cs="Times New Roman"/>
+          <w:sz w:val="24"/>
+          <w:szCs w:val="24"/>
+        </w:rPr>
+      </w:pPr>
+      <w:r>
+        <w:rPr>
+          <w:rFonts w:ascii="Times New Roman" w:hAnsi="Times New Roman" w:eastAsia="Times New Roman" w:cs="Times New Roman"/>
           <w:sz w:val="24"/>
           <w:szCs w:val="24"/>
         </w:rPr>
@@ -643,11 +736,10 @@
       </w:r>
       <w:r>
         <w:rPr>
-          <w:rFonts w:ascii="Times New Roman" w:eastAsia="Times New Roman" w:hAnsi="Times New Roman" w:cs="Times New Roman"/>
-          <w:sz w:val="24"/>
-          <w:szCs w:val="24"/>
-        </w:rPr>
-        <w:lastRenderedPageBreak/>
+          <w:rFonts w:ascii="Times New Roman" w:hAnsi="Times New Roman" w:eastAsia="Times New Roman" w:cs="Times New Roman"/>
+          <w:sz w:val="24"/>
+          <w:szCs w:val="24"/>
+        </w:rPr>
         <w:t xml:space="preserve">letak pabrik, membuat proposal bisnis, mengelola organisasi dengan berbagai permasalahannya, dsb. </w:t>
       </w:r>
     </w:p>
@@ -656,25 +748,25 @@
         <w:spacing w:after="0" w:line="240" w:lineRule="auto"/>
         <w:jc w:val="both"/>
         <w:rPr>
-          <w:rFonts w:ascii="Times New Roman" w:eastAsia="Times New Roman" w:hAnsi="Times New Roman" w:cs="Times New Roman"/>
-          <w:sz w:val="24"/>
-          <w:szCs w:val="24"/>
-        </w:rPr>
-      </w:pPr>
-    </w:p>
-    <w:p>
-      <w:pPr>
-        <w:spacing w:after="0" w:line="240" w:lineRule="auto"/>
-        <w:jc w:val="both"/>
-        <w:rPr>
-          <w:rFonts w:ascii="Times New Roman" w:eastAsia="Times New Roman" w:hAnsi="Times New Roman" w:cs="Times New Roman"/>
-          <w:sz w:val="24"/>
-          <w:szCs w:val="24"/>
-        </w:rPr>
-      </w:pPr>
-      <w:r>
-        <w:rPr>
-          <w:rFonts w:ascii="Times New Roman" w:eastAsia="Times New Roman" w:hAnsi="Times New Roman" w:cs="Times New Roman"/>
+          <w:rFonts w:ascii="Times New Roman" w:hAnsi="Times New Roman" w:eastAsia="Times New Roman" w:cs="Times New Roman"/>
+          <w:sz w:val="24"/>
+          <w:szCs w:val="24"/>
+        </w:rPr>
+      </w:pPr>
+    </w:p>
+    <w:p>
+      <w:pPr>
+        <w:spacing w:after="0" w:line="240" w:lineRule="auto"/>
+        <w:jc w:val="both"/>
+        <w:rPr>
+          <w:rFonts w:ascii="Times New Roman" w:hAnsi="Times New Roman" w:eastAsia="Times New Roman" w:cs="Times New Roman"/>
+          <w:sz w:val="24"/>
+          <w:szCs w:val="24"/>
+        </w:rPr>
+      </w:pPr>
+      <w:r>
+        <w:rPr>
+          <w:rFonts w:ascii="Times New Roman" w:hAnsi="Times New Roman" w:eastAsia="Times New Roman" w:cs="Times New Roman"/>
           <w:b/>
           <w:bCs/>
           <w:sz w:val="24"/>
@@ -684,7 +776,7 @@
       </w:r>
       <w:r>
         <w:rPr>
-          <w:rFonts w:ascii="Times New Roman" w:eastAsia="Times New Roman" w:hAnsi="Times New Roman" w:cs="Times New Roman"/>
+          <w:rFonts w:ascii="Times New Roman" w:hAnsi="Times New Roman" w:eastAsia="Times New Roman" w:cs="Times New Roman"/>
           <w:sz w:val="24"/>
           <w:szCs w:val="24"/>
         </w:rPr>
@@ -697,14 +789,14 @@
         <w:ind w:firstLine="720"/>
         <w:jc w:val="both"/>
         <w:rPr>
-          <w:rFonts w:ascii="Times New Roman" w:eastAsia="Times New Roman" w:hAnsi="Times New Roman" w:cs="Times New Roman"/>
-          <w:sz w:val="24"/>
-          <w:szCs w:val="24"/>
-        </w:rPr>
-      </w:pPr>
-      <w:r>
-        <w:rPr>
-          <w:rFonts w:ascii="Times New Roman" w:eastAsia="Times New Roman" w:hAnsi="Times New Roman" w:cs="Times New Roman"/>
+          <w:rFonts w:ascii="Times New Roman" w:hAnsi="Times New Roman" w:eastAsia="Times New Roman" w:cs="Times New Roman"/>
+          <w:sz w:val="24"/>
+          <w:szCs w:val="24"/>
+        </w:rPr>
+      </w:pPr>
+      <w:r>
+        <w:rPr>
+          <w:rFonts w:ascii="Times New Roman" w:hAnsi="Times New Roman" w:eastAsia="Times New Roman" w:cs="Times New Roman"/>
           <w:sz w:val="24"/>
           <w:szCs w:val="24"/>
         </w:rPr>
@@ -716,25 +808,25 @@
         <w:spacing w:after="0" w:line="240" w:lineRule="auto"/>
         <w:jc w:val="both"/>
         <w:rPr>
-          <w:rFonts w:ascii="Times New Roman" w:eastAsia="Times New Roman" w:hAnsi="Times New Roman" w:cs="Times New Roman"/>
-          <w:sz w:val="24"/>
-          <w:szCs w:val="24"/>
-        </w:rPr>
-      </w:pPr>
-    </w:p>
-    <w:p>
-      <w:pPr>
-        <w:spacing w:after="0" w:line="240" w:lineRule="auto"/>
-        <w:jc w:val="both"/>
-        <w:rPr>
-          <w:rFonts w:ascii="Times New Roman" w:eastAsia="Times New Roman" w:hAnsi="Times New Roman" w:cs="Times New Roman"/>
-          <w:sz w:val="24"/>
-          <w:szCs w:val="24"/>
-        </w:rPr>
-      </w:pPr>
-      <w:r>
-        <w:rPr>
-          <w:rFonts w:ascii="Times New Roman" w:eastAsia="Times New Roman" w:hAnsi="Times New Roman" w:cs="Times New Roman"/>
+          <w:rFonts w:ascii="Times New Roman" w:hAnsi="Times New Roman" w:eastAsia="Times New Roman" w:cs="Times New Roman"/>
+          <w:sz w:val="24"/>
+          <w:szCs w:val="24"/>
+        </w:rPr>
+      </w:pPr>
+    </w:p>
+    <w:p>
+      <w:pPr>
+        <w:spacing w:after="0" w:line="240" w:lineRule="auto"/>
+        <w:jc w:val="both"/>
+        <w:rPr>
+          <w:rFonts w:ascii="Times New Roman" w:hAnsi="Times New Roman" w:eastAsia="Times New Roman" w:cs="Times New Roman"/>
+          <w:sz w:val="24"/>
+          <w:szCs w:val="24"/>
+        </w:rPr>
+      </w:pPr>
+      <w:r>
+        <w:rPr>
+          <w:rFonts w:ascii="Times New Roman" w:hAnsi="Times New Roman" w:eastAsia="Times New Roman" w:cs="Times New Roman"/>
           <w:b/>
           <w:bCs/>
           <w:sz w:val="24"/>
@@ -744,7 +836,7 @@
       </w:r>
       <w:r>
         <w:rPr>
-          <w:rFonts w:ascii="Times New Roman" w:eastAsia="Times New Roman" w:hAnsi="Times New Roman" w:cs="Times New Roman"/>
+          <w:rFonts w:ascii="Times New Roman" w:hAnsi="Times New Roman" w:eastAsia="Times New Roman" w:cs="Times New Roman"/>
           <w:sz w:val="24"/>
           <w:szCs w:val="24"/>
         </w:rPr>
@@ -757,14 +849,14 @@
         <w:ind w:firstLine="720"/>
         <w:jc w:val="both"/>
         <w:rPr>
-          <w:rFonts w:ascii="Times New Roman" w:eastAsia="Times New Roman" w:hAnsi="Times New Roman" w:cs="Times New Roman"/>
-          <w:sz w:val="24"/>
-          <w:szCs w:val="24"/>
-        </w:rPr>
-      </w:pPr>
-      <w:r>
-        <w:rPr>
-          <w:rFonts w:ascii="Times New Roman" w:eastAsia="Times New Roman" w:hAnsi="Times New Roman" w:cs="Times New Roman"/>
+          <w:rFonts w:ascii="Times New Roman" w:hAnsi="Times New Roman" w:eastAsia="Times New Roman" w:cs="Times New Roman"/>
+          <w:sz w:val="24"/>
+          <w:szCs w:val="24"/>
+        </w:rPr>
+      </w:pPr>
+      <w:r>
+        <w:rPr>
+          <w:rFonts w:ascii="Times New Roman" w:hAnsi="Times New Roman" w:eastAsia="Times New Roman" w:cs="Times New Roman"/>
           <w:sz w:val="24"/>
           <w:szCs w:val="24"/>
         </w:rPr>
@@ -776,25 +868,25 @@
         <w:spacing w:after="0" w:line="240" w:lineRule="auto"/>
         <w:jc w:val="both"/>
         <w:rPr>
-          <w:rFonts w:ascii="Times New Roman" w:eastAsia="Times New Roman" w:hAnsi="Times New Roman" w:cs="Times New Roman"/>
-          <w:sz w:val="24"/>
-          <w:szCs w:val="24"/>
-        </w:rPr>
-      </w:pPr>
-    </w:p>
-    <w:p>
-      <w:pPr>
-        <w:spacing w:after="0" w:line="240" w:lineRule="auto"/>
-        <w:jc w:val="both"/>
-        <w:rPr>
-          <w:rFonts w:ascii="Times New Roman" w:eastAsia="Times New Roman" w:hAnsi="Times New Roman" w:cs="Times New Roman"/>
-          <w:sz w:val="24"/>
-          <w:szCs w:val="24"/>
-        </w:rPr>
-      </w:pPr>
-      <w:r>
-        <w:rPr>
-          <w:rFonts w:ascii="Times New Roman" w:eastAsia="Times New Roman" w:hAnsi="Times New Roman" w:cs="Times New Roman"/>
+          <w:rFonts w:ascii="Times New Roman" w:hAnsi="Times New Roman" w:eastAsia="Times New Roman" w:cs="Times New Roman"/>
+          <w:sz w:val="24"/>
+          <w:szCs w:val="24"/>
+        </w:rPr>
+      </w:pPr>
+    </w:p>
+    <w:p>
+      <w:pPr>
+        <w:spacing w:after="0" w:line="240" w:lineRule="auto"/>
+        <w:jc w:val="both"/>
+        <w:rPr>
+          <w:rFonts w:ascii="Times New Roman" w:hAnsi="Times New Roman" w:eastAsia="Times New Roman" w:cs="Times New Roman"/>
+          <w:sz w:val="24"/>
+          <w:szCs w:val="24"/>
+        </w:rPr>
+      </w:pPr>
+      <w:r>
+        <w:rPr>
+          <w:rFonts w:ascii="Times New Roman" w:hAnsi="Times New Roman" w:eastAsia="Times New Roman" w:cs="Times New Roman"/>
           <w:b/>
           <w:bCs/>
           <w:sz w:val="24"/>
@@ -804,7 +896,7 @@
       </w:r>
       <w:r>
         <w:rPr>
-          <w:rFonts w:ascii="Times New Roman" w:eastAsia="Times New Roman" w:hAnsi="Times New Roman" w:cs="Times New Roman"/>
+          <w:rFonts w:ascii="Times New Roman" w:hAnsi="Times New Roman" w:eastAsia="Times New Roman" w:cs="Times New Roman"/>
           <w:sz w:val="24"/>
           <w:szCs w:val="24"/>
         </w:rPr>
@@ -817,14 +909,14 @@
         <w:ind w:firstLine="720"/>
         <w:jc w:val="both"/>
         <w:rPr>
-          <w:rFonts w:ascii="Times New Roman" w:eastAsia="Times New Roman" w:hAnsi="Times New Roman" w:cs="Times New Roman"/>
-          <w:sz w:val="24"/>
-          <w:szCs w:val="24"/>
-        </w:rPr>
-      </w:pPr>
-      <w:r>
-        <w:rPr>
-          <w:rFonts w:ascii="Times New Roman" w:eastAsia="Times New Roman" w:hAnsi="Times New Roman" w:cs="Times New Roman"/>
+          <w:rFonts w:ascii="Times New Roman" w:hAnsi="Times New Roman" w:eastAsia="Times New Roman" w:cs="Times New Roman"/>
+          <w:sz w:val="24"/>
+          <w:szCs w:val="24"/>
+        </w:rPr>
+      </w:pPr>
+      <w:r>
+        <w:rPr>
+          <w:rFonts w:ascii="Times New Roman" w:hAnsi="Times New Roman" w:eastAsia="Times New Roman" w:cs="Times New Roman"/>
           <w:sz w:val="24"/>
           <w:szCs w:val="24"/>
         </w:rPr>
@@ -836,25 +928,25 @@
         <w:spacing w:after="0" w:line="240" w:lineRule="auto"/>
         <w:jc w:val="both"/>
         <w:rPr>
-          <w:rFonts w:ascii="Times New Roman" w:eastAsia="Times New Roman" w:hAnsi="Times New Roman" w:cs="Times New Roman"/>
-          <w:sz w:val="24"/>
-          <w:szCs w:val="24"/>
-        </w:rPr>
-      </w:pPr>
-    </w:p>
-    <w:p>
-      <w:pPr>
-        <w:spacing w:after="0" w:line="240" w:lineRule="auto"/>
-        <w:jc w:val="both"/>
-        <w:rPr>
-          <w:rFonts w:ascii="Times New Roman" w:eastAsia="Times New Roman" w:hAnsi="Times New Roman" w:cs="Times New Roman"/>
-          <w:sz w:val="24"/>
-          <w:szCs w:val="24"/>
-        </w:rPr>
-      </w:pPr>
-      <w:r>
-        <w:rPr>
-          <w:rFonts w:ascii="Times New Roman" w:eastAsia="Times New Roman" w:hAnsi="Times New Roman" w:cs="Times New Roman"/>
+          <w:rFonts w:ascii="Times New Roman" w:hAnsi="Times New Roman" w:eastAsia="Times New Roman" w:cs="Times New Roman"/>
+          <w:sz w:val="24"/>
+          <w:szCs w:val="24"/>
+        </w:rPr>
+      </w:pPr>
+    </w:p>
+    <w:p>
+      <w:pPr>
+        <w:spacing w:after="0" w:line="240" w:lineRule="auto"/>
+        <w:jc w:val="both"/>
+        <w:rPr>
+          <w:rFonts w:ascii="Times New Roman" w:hAnsi="Times New Roman" w:eastAsia="Times New Roman" w:cs="Times New Roman"/>
+          <w:sz w:val="24"/>
+          <w:szCs w:val="24"/>
+        </w:rPr>
+      </w:pPr>
+      <w:r>
+        <w:rPr>
+          <w:rFonts w:ascii="Times New Roman" w:hAnsi="Times New Roman" w:eastAsia="Times New Roman" w:cs="Times New Roman"/>
           <w:b/>
           <w:bCs/>
           <w:sz w:val="24"/>
@@ -864,7 +956,7 @@
       </w:r>
       <w:r>
         <w:rPr>
-          <w:rFonts w:ascii="Times New Roman" w:eastAsia="Times New Roman" w:hAnsi="Times New Roman" w:cs="Times New Roman"/>
+          <w:rFonts w:ascii="Times New Roman" w:hAnsi="Times New Roman" w:eastAsia="Times New Roman" w:cs="Times New Roman"/>
           <w:sz w:val="24"/>
           <w:szCs w:val="24"/>
         </w:rPr>
@@ -877,14 +969,14 @@
         <w:ind w:firstLine="360"/>
         <w:jc w:val="both"/>
         <w:rPr>
-          <w:rFonts w:ascii="Times New Roman" w:eastAsia="Times New Roman" w:hAnsi="Times New Roman" w:cs="Times New Roman"/>
-          <w:sz w:val="24"/>
-          <w:szCs w:val="24"/>
-        </w:rPr>
-      </w:pPr>
-      <w:r>
-        <w:rPr>
-          <w:rFonts w:ascii="Times New Roman" w:eastAsia="Times New Roman" w:hAnsi="Times New Roman" w:cs="Times New Roman"/>
+          <w:rFonts w:ascii="Times New Roman" w:hAnsi="Times New Roman" w:eastAsia="Times New Roman" w:cs="Times New Roman"/>
+          <w:sz w:val="24"/>
+          <w:szCs w:val="24"/>
+        </w:rPr>
+      </w:pPr>
+      <w:r>
+        <w:rPr>
+          <w:rFonts w:ascii="Times New Roman" w:hAnsi="Times New Roman" w:eastAsia="Times New Roman" w:cs="Times New Roman"/>
           <w:sz w:val="24"/>
           <w:szCs w:val="24"/>
         </w:rPr>
@@ -898,16 +990,17 @@
           <w:numId w:val="5"/>
         </w:numPr>
         <w:spacing w:after="0" w:line="240" w:lineRule="auto"/>
-        <w:jc w:val="both"/>
-        <w:rPr>
-          <w:rFonts w:ascii="Times New Roman" w:eastAsia="Times New Roman" w:hAnsi="Times New Roman" w:cs="Times New Roman"/>
-          <w:sz w:val="24"/>
-          <w:szCs w:val="24"/>
-        </w:rPr>
-      </w:pPr>
-      <w:r>
-        <w:rPr>
-          <w:rFonts w:ascii="Times New Roman" w:eastAsia="Times New Roman" w:hAnsi="Times New Roman" w:cs="Times New Roman"/>
+        <w:ind w:left="720" w:hanging="360"/>
+        <w:jc w:val="both"/>
+        <w:rPr>
+          <w:rFonts w:ascii="Times New Roman" w:hAnsi="Times New Roman" w:eastAsia="Times New Roman" w:cs="Times New Roman"/>
+          <w:sz w:val="24"/>
+          <w:szCs w:val="24"/>
+        </w:rPr>
+      </w:pPr>
+      <w:r>
+        <w:rPr>
+          <w:rFonts w:ascii="Times New Roman" w:hAnsi="Times New Roman" w:eastAsia="Times New Roman" w:cs="Times New Roman"/>
           <w:sz w:val="24"/>
           <w:szCs w:val="24"/>
         </w:rPr>
@@ -921,16 +1014,17 @@
           <w:numId w:val="5"/>
         </w:numPr>
         <w:spacing w:after="0" w:line="240" w:lineRule="auto"/>
-        <w:jc w:val="both"/>
-        <w:rPr>
-          <w:rFonts w:ascii="Times New Roman" w:eastAsia="Times New Roman" w:hAnsi="Times New Roman" w:cs="Times New Roman"/>
-          <w:sz w:val="24"/>
-          <w:szCs w:val="24"/>
-        </w:rPr>
-      </w:pPr>
-      <w:r>
-        <w:rPr>
-          <w:rFonts w:ascii="Times New Roman" w:eastAsia="Times New Roman" w:hAnsi="Times New Roman" w:cs="Times New Roman"/>
+        <w:ind w:left="720" w:hanging="360"/>
+        <w:jc w:val="both"/>
+        <w:rPr>
+          <w:rFonts w:ascii="Times New Roman" w:hAnsi="Times New Roman" w:eastAsia="Times New Roman" w:cs="Times New Roman"/>
+          <w:sz w:val="24"/>
+          <w:szCs w:val="24"/>
+        </w:rPr>
+      </w:pPr>
+      <w:r>
+        <w:rPr>
+          <w:rFonts w:ascii="Times New Roman" w:hAnsi="Times New Roman" w:eastAsia="Times New Roman" w:cs="Times New Roman"/>
           <w:sz w:val="24"/>
           <w:szCs w:val="24"/>
         </w:rPr>
@@ -944,16 +1038,17 @@
           <w:numId w:val="5"/>
         </w:numPr>
         <w:spacing w:after="0" w:line="240" w:lineRule="auto"/>
-        <w:jc w:val="both"/>
-        <w:rPr>
-          <w:rFonts w:ascii="Times New Roman" w:eastAsia="Times New Roman" w:hAnsi="Times New Roman" w:cs="Times New Roman"/>
-          <w:sz w:val="24"/>
-          <w:szCs w:val="24"/>
-        </w:rPr>
-      </w:pPr>
-      <w:r>
-        <w:rPr>
-          <w:rFonts w:ascii="Times New Roman" w:eastAsia="Times New Roman" w:hAnsi="Times New Roman" w:cs="Times New Roman"/>
+        <w:ind w:left="720" w:hanging="360"/>
+        <w:jc w:val="both"/>
+        <w:rPr>
+          <w:rFonts w:ascii="Times New Roman" w:hAnsi="Times New Roman" w:eastAsia="Times New Roman" w:cs="Times New Roman"/>
+          <w:sz w:val="24"/>
+          <w:szCs w:val="24"/>
+        </w:rPr>
+      </w:pPr>
+      <w:r>
+        <w:rPr>
+          <w:rFonts w:ascii="Times New Roman" w:hAnsi="Times New Roman" w:eastAsia="Times New Roman" w:cs="Times New Roman"/>
           <w:sz w:val="24"/>
           <w:szCs w:val="24"/>
         </w:rPr>
@@ -967,16 +1062,17 @@
           <w:numId w:val="5"/>
         </w:numPr>
         <w:spacing w:after="0" w:line="240" w:lineRule="auto"/>
-        <w:jc w:val="both"/>
-        <w:rPr>
-          <w:rFonts w:ascii="Times New Roman" w:eastAsia="Times New Roman" w:hAnsi="Times New Roman" w:cs="Times New Roman"/>
-          <w:sz w:val="24"/>
-          <w:szCs w:val="24"/>
-        </w:rPr>
-      </w:pPr>
-      <w:r>
-        <w:rPr>
-          <w:rFonts w:ascii="Times New Roman" w:eastAsia="Times New Roman" w:hAnsi="Times New Roman" w:cs="Times New Roman"/>
+        <w:ind w:left="720" w:hanging="360"/>
+        <w:jc w:val="both"/>
+        <w:rPr>
+          <w:rFonts w:ascii="Times New Roman" w:hAnsi="Times New Roman" w:eastAsia="Times New Roman" w:cs="Times New Roman"/>
+          <w:sz w:val="24"/>
+          <w:szCs w:val="24"/>
+        </w:rPr>
+      </w:pPr>
+      <w:r>
+        <w:rPr>
+          <w:rFonts w:ascii="Times New Roman" w:hAnsi="Times New Roman" w:eastAsia="Times New Roman" w:cs="Times New Roman"/>
           <w:sz w:val="24"/>
           <w:szCs w:val="24"/>
         </w:rPr>
@@ -990,16 +1086,17 @@
           <w:numId w:val="5"/>
         </w:numPr>
         <w:spacing w:after="0" w:line="240" w:lineRule="auto"/>
-        <w:jc w:val="both"/>
-        <w:rPr>
-          <w:rFonts w:ascii="Times New Roman" w:eastAsia="Times New Roman" w:hAnsi="Times New Roman" w:cs="Times New Roman"/>
-          <w:sz w:val="24"/>
-          <w:szCs w:val="24"/>
-        </w:rPr>
-      </w:pPr>
-      <w:r>
-        <w:rPr>
-          <w:rFonts w:ascii="Times New Roman" w:eastAsia="Times New Roman" w:hAnsi="Times New Roman" w:cs="Times New Roman"/>
+        <w:ind w:left="720" w:hanging="360"/>
+        <w:jc w:val="both"/>
+        <w:rPr>
+          <w:rFonts w:ascii="Times New Roman" w:hAnsi="Times New Roman" w:eastAsia="Times New Roman" w:cs="Times New Roman"/>
+          <w:sz w:val="24"/>
+          <w:szCs w:val="24"/>
+        </w:rPr>
+      </w:pPr>
+      <w:r>
+        <w:rPr>
+          <w:rFonts w:ascii="Times New Roman" w:hAnsi="Times New Roman" w:eastAsia="Times New Roman" w:cs="Times New Roman"/>
           <w:sz w:val="24"/>
           <w:szCs w:val="24"/>
         </w:rPr>
@@ -1013,16 +1110,17 @@
           <w:numId w:val="5"/>
         </w:numPr>
         <w:spacing w:after="0" w:line="240" w:lineRule="auto"/>
-        <w:jc w:val="both"/>
-        <w:rPr>
-          <w:rFonts w:ascii="Times New Roman" w:eastAsia="Times New Roman" w:hAnsi="Times New Roman" w:cs="Times New Roman"/>
-          <w:sz w:val="24"/>
-          <w:szCs w:val="24"/>
-        </w:rPr>
-      </w:pPr>
-      <w:r>
-        <w:rPr>
-          <w:rFonts w:ascii="Times New Roman" w:eastAsia="Times New Roman" w:hAnsi="Times New Roman" w:cs="Times New Roman"/>
+        <w:ind w:left="720" w:hanging="360"/>
+        <w:jc w:val="both"/>
+        <w:rPr>
+          <w:rFonts w:ascii="Times New Roman" w:hAnsi="Times New Roman" w:eastAsia="Times New Roman" w:cs="Times New Roman"/>
+          <w:sz w:val="24"/>
+          <w:szCs w:val="24"/>
+        </w:rPr>
+      </w:pPr>
+      <w:r>
+        <w:rPr>
+          <w:rFonts w:ascii="Times New Roman" w:hAnsi="Times New Roman" w:eastAsia="Times New Roman" w:cs="Times New Roman"/>
           <w:sz w:val="24"/>
           <w:szCs w:val="24"/>
         </w:rPr>
@@ -1036,16 +1134,17 @@
           <w:numId w:val="5"/>
         </w:numPr>
         <w:spacing w:after="0" w:line="240" w:lineRule="auto"/>
-        <w:jc w:val="both"/>
-        <w:rPr>
-          <w:rFonts w:ascii="Times New Roman" w:eastAsia="Times New Roman" w:hAnsi="Times New Roman" w:cs="Times New Roman"/>
-          <w:sz w:val="24"/>
-          <w:szCs w:val="24"/>
-        </w:rPr>
-      </w:pPr>
-      <w:r>
-        <w:rPr>
-          <w:rFonts w:ascii="Times New Roman" w:eastAsia="Times New Roman" w:hAnsi="Times New Roman" w:cs="Times New Roman"/>
+        <w:ind w:left="720" w:hanging="360"/>
+        <w:jc w:val="both"/>
+        <w:rPr>
+          <w:rFonts w:ascii="Times New Roman" w:hAnsi="Times New Roman" w:eastAsia="Times New Roman" w:cs="Times New Roman"/>
+          <w:sz w:val="24"/>
+          <w:szCs w:val="24"/>
+        </w:rPr>
+      </w:pPr>
+      <w:r>
+        <w:rPr>
+          <w:rFonts w:ascii="Times New Roman" w:hAnsi="Times New Roman" w:eastAsia="Times New Roman" w:cs="Times New Roman"/>
           <w:sz w:val="24"/>
           <w:szCs w:val="24"/>
         </w:rPr>
@@ -1059,16 +1158,17 @@
           <w:numId w:val="5"/>
         </w:numPr>
         <w:spacing w:after="0" w:line="240" w:lineRule="auto"/>
-        <w:jc w:val="both"/>
-        <w:rPr>
-          <w:rFonts w:ascii="Times New Roman" w:eastAsia="Times New Roman" w:hAnsi="Times New Roman" w:cs="Times New Roman"/>
-          <w:sz w:val="24"/>
-          <w:szCs w:val="24"/>
-        </w:rPr>
-      </w:pPr>
-      <w:r>
-        <w:rPr>
-          <w:rFonts w:ascii="Times New Roman" w:eastAsia="Times New Roman" w:hAnsi="Times New Roman" w:cs="Times New Roman"/>
+        <w:ind w:left="720" w:hanging="360"/>
+        <w:jc w:val="both"/>
+        <w:rPr>
+          <w:rFonts w:ascii="Times New Roman" w:hAnsi="Times New Roman" w:eastAsia="Times New Roman" w:cs="Times New Roman"/>
+          <w:sz w:val="24"/>
+          <w:szCs w:val="24"/>
+        </w:rPr>
+      </w:pPr>
+      <w:r>
+        <w:rPr>
+          <w:rFonts w:ascii="Times New Roman" w:hAnsi="Times New Roman" w:eastAsia="Times New Roman" w:cs="Times New Roman"/>
           <w:sz w:val="24"/>
           <w:szCs w:val="24"/>
         </w:rPr>
@@ -1082,16 +1182,17 @@
           <w:numId w:val="5"/>
         </w:numPr>
         <w:spacing w:after="0" w:line="240" w:lineRule="auto"/>
-        <w:jc w:val="both"/>
-        <w:rPr>
-          <w:rFonts w:ascii="Times New Roman" w:eastAsia="Times New Roman" w:hAnsi="Times New Roman" w:cs="Times New Roman"/>
-          <w:sz w:val="24"/>
-          <w:szCs w:val="24"/>
-        </w:rPr>
-      </w:pPr>
-      <w:r>
-        <w:rPr>
-          <w:rFonts w:ascii="Times New Roman" w:eastAsia="Times New Roman" w:hAnsi="Times New Roman" w:cs="Times New Roman"/>
+        <w:ind w:left="720" w:hanging="360"/>
+        <w:jc w:val="both"/>
+        <w:rPr>
+          <w:rFonts w:ascii="Times New Roman" w:hAnsi="Times New Roman" w:eastAsia="Times New Roman" w:cs="Times New Roman"/>
+          <w:sz w:val="24"/>
+          <w:szCs w:val="24"/>
+        </w:rPr>
+      </w:pPr>
+      <w:r>
+        <w:rPr>
+          <w:rFonts w:ascii="Times New Roman" w:hAnsi="Times New Roman" w:eastAsia="Times New Roman" w:cs="Times New Roman"/>
           <w:sz w:val="24"/>
           <w:szCs w:val="24"/>
         </w:rPr>
@@ -1104,25 +1205,25 @@
         <w:ind w:left="720"/>
         <w:jc w:val="both"/>
         <w:rPr>
-          <w:rFonts w:ascii="Times New Roman" w:eastAsia="Times New Roman" w:hAnsi="Times New Roman" w:cs="Times New Roman"/>
-          <w:sz w:val="24"/>
-          <w:szCs w:val="24"/>
-        </w:rPr>
-      </w:pPr>
-    </w:p>
-    <w:p>
-      <w:pPr>
-        <w:spacing w:after="0" w:line="240" w:lineRule="auto"/>
-        <w:jc w:val="both"/>
-        <w:rPr>
-          <w:rFonts w:ascii="Times New Roman" w:eastAsia="Times New Roman" w:hAnsi="Times New Roman" w:cs="Times New Roman"/>
-          <w:sz w:val="24"/>
-          <w:szCs w:val="24"/>
-        </w:rPr>
-      </w:pPr>
-      <w:r>
-        <w:rPr>
-          <w:rFonts w:ascii="Times New Roman" w:eastAsia="Times New Roman" w:hAnsi="Times New Roman" w:cs="Times New Roman"/>
+          <w:rFonts w:ascii="Times New Roman" w:hAnsi="Times New Roman" w:eastAsia="Times New Roman" w:cs="Times New Roman"/>
+          <w:sz w:val="24"/>
+          <w:szCs w:val="24"/>
+        </w:rPr>
+      </w:pPr>
+    </w:p>
+    <w:p>
+      <w:pPr>
+        <w:spacing w:after="0" w:line="240" w:lineRule="auto"/>
+        <w:jc w:val="both"/>
+        <w:rPr>
+          <w:rFonts w:ascii="Times New Roman" w:hAnsi="Times New Roman" w:eastAsia="Times New Roman" w:cs="Times New Roman"/>
+          <w:sz w:val="24"/>
+          <w:szCs w:val="24"/>
+        </w:rPr>
+      </w:pPr>
+      <w:r>
+        <w:rPr>
+          <w:rFonts w:ascii="Times New Roman" w:hAnsi="Times New Roman" w:eastAsia="Times New Roman" w:cs="Times New Roman"/>
           <w:b/>
           <w:bCs/>
           <w:sz w:val="24"/>
@@ -1132,7 +1233,7 @@
       </w:r>
       <w:r>
         <w:rPr>
-          <w:rFonts w:ascii="Times New Roman" w:eastAsia="Times New Roman" w:hAnsi="Times New Roman" w:cs="Times New Roman"/>
+          <w:rFonts w:ascii="Times New Roman" w:hAnsi="Times New Roman" w:eastAsia="Times New Roman" w:cs="Times New Roman"/>
           <w:sz w:val="24"/>
           <w:szCs w:val="24"/>
         </w:rPr>
@@ -1145,14 +1246,14 @@
         <w:ind w:firstLine="720"/>
         <w:jc w:val="both"/>
         <w:rPr>
-          <w:rFonts w:ascii="Times New Roman" w:eastAsia="Times New Roman" w:hAnsi="Times New Roman" w:cs="Times New Roman"/>
-          <w:sz w:val="24"/>
-          <w:szCs w:val="24"/>
-        </w:rPr>
-      </w:pPr>
-      <w:r>
-        <w:rPr>
-          <w:rFonts w:ascii="Times New Roman" w:eastAsia="Times New Roman" w:hAnsi="Times New Roman" w:cs="Times New Roman"/>
+          <w:rFonts w:ascii="Times New Roman" w:hAnsi="Times New Roman" w:eastAsia="Times New Roman" w:cs="Times New Roman"/>
+          <w:sz w:val="24"/>
+          <w:szCs w:val="24"/>
+        </w:rPr>
+      </w:pPr>
+      <w:r>
+        <w:rPr>
+          <w:rFonts w:ascii="Times New Roman" w:hAnsi="Times New Roman" w:eastAsia="Times New Roman" w:cs="Times New Roman"/>
           <w:sz w:val="24"/>
           <w:szCs w:val="24"/>
         </w:rPr>
@@ -1164,25 +1265,25 @@
         <w:spacing w:after="0" w:line="240" w:lineRule="auto"/>
         <w:jc w:val="both"/>
         <w:rPr>
-          <w:rFonts w:ascii="Times New Roman" w:eastAsia="Times New Roman" w:hAnsi="Times New Roman" w:cs="Times New Roman"/>
-          <w:sz w:val="24"/>
-          <w:szCs w:val="24"/>
-        </w:rPr>
-      </w:pPr>
-    </w:p>
-    <w:p>
-      <w:pPr>
-        <w:spacing w:after="0" w:line="240" w:lineRule="auto"/>
-        <w:jc w:val="both"/>
-        <w:rPr>
-          <w:rFonts w:ascii="Times New Roman" w:eastAsia="Times New Roman" w:hAnsi="Times New Roman" w:cs="Times New Roman"/>
-          <w:sz w:val="24"/>
-          <w:szCs w:val="24"/>
-        </w:rPr>
-      </w:pPr>
-      <w:r>
-        <w:rPr>
-          <w:rFonts w:ascii="Times New Roman" w:eastAsia="Times New Roman" w:hAnsi="Times New Roman" w:cs="Times New Roman"/>
+          <w:rFonts w:ascii="Times New Roman" w:hAnsi="Times New Roman" w:eastAsia="Times New Roman" w:cs="Times New Roman"/>
+          <w:sz w:val="24"/>
+          <w:szCs w:val="24"/>
+        </w:rPr>
+      </w:pPr>
+    </w:p>
+    <w:p>
+      <w:pPr>
+        <w:spacing w:after="0" w:line="240" w:lineRule="auto"/>
+        <w:jc w:val="both"/>
+        <w:rPr>
+          <w:rFonts w:ascii="Times New Roman" w:hAnsi="Times New Roman" w:eastAsia="Times New Roman" w:cs="Times New Roman"/>
+          <w:sz w:val="24"/>
+          <w:szCs w:val="24"/>
+        </w:rPr>
+      </w:pPr>
+      <w:r>
+        <w:rPr>
+          <w:rFonts w:ascii="Times New Roman" w:hAnsi="Times New Roman" w:eastAsia="Times New Roman" w:cs="Times New Roman"/>
           <w:b/>
           <w:bCs/>
           <w:sz w:val="24"/>
@@ -1192,7 +1293,7 @@
       </w:r>
       <w:r>
         <w:rPr>
-          <w:rFonts w:ascii="Times New Roman" w:eastAsia="Times New Roman" w:hAnsi="Times New Roman" w:cs="Times New Roman"/>
+          <w:rFonts w:ascii="Times New Roman" w:hAnsi="Times New Roman" w:eastAsia="Times New Roman" w:cs="Times New Roman"/>
           <w:b/>
           <w:bCs/>
           <w:sz w:val="24"/>
@@ -1208,27 +1309,28 @@
           <w:numId w:val="6"/>
         </w:numPr>
         <w:spacing w:after="0" w:line="240" w:lineRule="auto"/>
-        <w:jc w:val="both"/>
-        <w:rPr>
-          <w:rFonts w:ascii="Times New Roman" w:eastAsia="Times New Roman" w:hAnsi="Times New Roman" w:cs="Times New Roman"/>
-          <w:sz w:val="24"/>
-          <w:szCs w:val="24"/>
-        </w:rPr>
-      </w:pPr>
-      <w:r>
-        <w:rPr>
-          <w:rFonts w:ascii="Times New Roman" w:eastAsia="Times New Roman" w:hAnsi="Times New Roman" w:cs="Times New Roman"/>
+        <w:ind w:left="720" w:hanging="360"/>
+        <w:jc w:val="both"/>
+        <w:rPr>
+          <w:rFonts w:ascii="Times New Roman" w:hAnsi="Times New Roman" w:eastAsia="Times New Roman" w:cs="Times New Roman"/>
+          <w:sz w:val="24"/>
+          <w:szCs w:val="24"/>
+        </w:rPr>
+      </w:pPr>
+      <w:r>
+        <w:lastRenderedPageBreak/>
+        <w:rPr>
+          <w:rFonts w:ascii="Times New Roman" w:hAnsi="Times New Roman" w:eastAsia="Times New Roman" w:cs="Times New Roman"/>
           <w:b/>
           <w:bCs/>
           <w:sz w:val="24"/>
           <w:szCs w:val="24"/>
         </w:rPr>
-        <w:lastRenderedPageBreak/>
         <w:t>Institusi</w:t>
       </w:r>
       <w:r>
         <w:rPr>
-          <w:rFonts w:ascii="Times New Roman" w:eastAsia="Times New Roman" w:hAnsi="Times New Roman" w:cs="Times New Roman"/>
+          <w:rFonts w:ascii="Times New Roman" w:hAnsi="Times New Roman" w:eastAsia="Times New Roman" w:cs="Times New Roman"/>
           <w:sz w:val="24"/>
           <w:szCs w:val="24"/>
         </w:rPr>
@@ -1242,16 +1344,17 @@
           <w:numId w:val="6"/>
         </w:numPr>
         <w:spacing w:after="0" w:line="240" w:lineRule="auto"/>
-        <w:jc w:val="both"/>
-        <w:rPr>
-          <w:rFonts w:ascii="Times New Roman" w:eastAsia="Times New Roman" w:hAnsi="Times New Roman" w:cs="Times New Roman"/>
-          <w:sz w:val="24"/>
-          <w:szCs w:val="24"/>
-        </w:rPr>
-      </w:pPr>
-      <w:r>
-        <w:rPr>
-          <w:rFonts w:ascii="Times New Roman" w:eastAsia="Times New Roman" w:hAnsi="Times New Roman" w:cs="Times New Roman"/>
+        <w:ind w:left="720" w:hanging="360"/>
+        <w:jc w:val="both"/>
+        <w:rPr>
+          <w:rFonts w:ascii="Times New Roman" w:hAnsi="Times New Roman" w:eastAsia="Times New Roman" w:cs="Times New Roman"/>
+          <w:sz w:val="24"/>
+          <w:szCs w:val="24"/>
+        </w:rPr>
+      </w:pPr>
+      <w:r>
+        <w:rPr>
+          <w:rFonts w:ascii="Times New Roman" w:hAnsi="Times New Roman" w:eastAsia="Times New Roman" w:cs="Times New Roman"/>
           <w:b/>
           <w:bCs/>
           <w:sz w:val="24"/>
@@ -1261,7 +1364,7 @@
       </w:r>
       <w:r>
         <w:rPr>
-          <w:rFonts w:ascii="Times New Roman" w:eastAsia="Times New Roman" w:hAnsi="Times New Roman" w:cs="Times New Roman"/>
+          <w:rFonts w:ascii="Times New Roman" w:hAnsi="Times New Roman" w:eastAsia="Times New Roman" w:cs="Times New Roman"/>
           <w:sz w:val="24"/>
           <w:szCs w:val="24"/>
         </w:rPr>
@@ -1275,16 +1378,17 @@
           <w:numId w:val="6"/>
         </w:numPr>
         <w:spacing w:after="0" w:line="240" w:lineRule="auto"/>
-        <w:jc w:val="both"/>
-        <w:rPr>
-          <w:rFonts w:ascii="Times New Roman" w:eastAsia="Times New Roman" w:hAnsi="Times New Roman" w:cs="Times New Roman"/>
-          <w:sz w:val="24"/>
-          <w:szCs w:val="24"/>
-        </w:rPr>
-      </w:pPr>
-      <w:r>
-        <w:rPr>
-          <w:rFonts w:ascii="Times New Roman" w:eastAsia="Times New Roman" w:hAnsi="Times New Roman" w:cs="Times New Roman"/>
+        <w:ind w:left="720" w:hanging="360"/>
+        <w:jc w:val="both"/>
+        <w:rPr>
+          <w:rFonts w:ascii="Times New Roman" w:hAnsi="Times New Roman" w:eastAsia="Times New Roman" w:cs="Times New Roman"/>
+          <w:sz w:val="24"/>
+          <w:szCs w:val="24"/>
+        </w:rPr>
+      </w:pPr>
+      <w:r>
+        <w:rPr>
+          <w:rFonts w:ascii="Times New Roman" w:hAnsi="Times New Roman" w:eastAsia="Times New Roman" w:cs="Times New Roman"/>
           <w:b/>
           <w:bCs/>
           <w:sz w:val="24"/>
@@ -1294,7 +1398,7 @@
       </w:r>
       <w:r>
         <w:rPr>
-          <w:rFonts w:ascii="Times New Roman" w:eastAsia="Times New Roman" w:hAnsi="Times New Roman" w:cs="Times New Roman"/>
+          <w:rFonts w:ascii="Times New Roman" w:hAnsi="Times New Roman" w:eastAsia="Times New Roman" w:cs="Times New Roman"/>
           <w:sz w:val="24"/>
           <w:szCs w:val="24"/>
         </w:rPr>
@@ -1308,16 +1412,17 @@
           <w:numId w:val="6"/>
         </w:numPr>
         <w:spacing w:after="0" w:line="240" w:lineRule="auto"/>
-        <w:jc w:val="both"/>
-        <w:rPr>
-          <w:rFonts w:ascii="Times New Roman" w:eastAsia="Times New Roman" w:hAnsi="Times New Roman" w:cs="Times New Roman"/>
-          <w:sz w:val="24"/>
-          <w:szCs w:val="24"/>
-        </w:rPr>
-      </w:pPr>
-      <w:r>
-        <w:rPr>
-          <w:rFonts w:ascii="Times New Roman" w:eastAsia="Times New Roman" w:hAnsi="Times New Roman" w:cs="Times New Roman"/>
+        <w:ind w:left="720" w:hanging="360"/>
+        <w:jc w:val="both"/>
+        <w:rPr>
+          <w:rFonts w:ascii="Times New Roman" w:hAnsi="Times New Roman" w:eastAsia="Times New Roman" w:cs="Times New Roman"/>
+          <w:sz w:val="24"/>
+          <w:szCs w:val="24"/>
+        </w:rPr>
+      </w:pPr>
+      <w:r>
+        <w:rPr>
+          <w:rFonts w:ascii="Times New Roman" w:hAnsi="Times New Roman" w:eastAsia="Times New Roman" w:cs="Times New Roman"/>
           <w:b/>
           <w:bCs/>
           <w:sz w:val="24"/>
@@ -1327,7 +1432,7 @@
       </w:r>
       <w:r>
         <w:rPr>
-          <w:rFonts w:ascii="Times New Roman" w:eastAsia="Times New Roman" w:hAnsi="Times New Roman" w:cs="Times New Roman"/>
+          <w:rFonts w:ascii="Times New Roman" w:hAnsi="Times New Roman" w:eastAsia="Times New Roman" w:cs="Times New Roman"/>
           <w:sz w:val="24"/>
           <w:szCs w:val="24"/>
         </w:rPr>
@@ -1341,16 +1446,17 @@
           <w:numId w:val="6"/>
         </w:numPr>
         <w:spacing w:after="0" w:line="240" w:lineRule="auto"/>
-        <w:jc w:val="both"/>
-        <w:rPr>
-          <w:rFonts w:ascii="Times New Roman" w:eastAsia="Times New Roman" w:hAnsi="Times New Roman" w:cs="Times New Roman"/>
-          <w:sz w:val="24"/>
-          <w:szCs w:val="24"/>
-        </w:rPr>
-      </w:pPr>
-      <w:r>
-        <w:rPr>
-          <w:rFonts w:ascii="Times New Roman" w:eastAsia="Times New Roman" w:hAnsi="Times New Roman" w:cs="Times New Roman"/>
+        <w:ind w:left="720" w:hanging="360"/>
+        <w:jc w:val="both"/>
+        <w:rPr>
+          <w:rFonts w:ascii="Times New Roman" w:hAnsi="Times New Roman" w:eastAsia="Times New Roman" w:cs="Times New Roman"/>
+          <w:sz w:val="24"/>
+          <w:szCs w:val="24"/>
+        </w:rPr>
+      </w:pPr>
+      <w:r>
+        <w:rPr>
+          <w:rFonts w:ascii="Times New Roman" w:hAnsi="Times New Roman" w:eastAsia="Times New Roman" w:cs="Times New Roman"/>
           <w:b/>
           <w:bCs/>
           <w:sz w:val="24"/>
@@ -1360,7 +1466,7 @@
       </w:r>
       <w:r>
         <w:rPr>
-          <w:rFonts w:ascii="Times New Roman" w:eastAsia="Times New Roman" w:hAnsi="Times New Roman" w:cs="Times New Roman"/>
+          <w:rFonts w:ascii="Times New Roman" w:hAnsi="Times New Roman" w:eastAsia="Times New Roman" w:cs="Times New Roman"/>
           <w:sz w:val="24"/>
           <w:szCs w:val="24"/>
         </w:rPr>
@@ -1374,16 +1480,17 @@
           <w:numId w:val="6"/>
         </w:numPr>
         <w:spacing w:after="0" w:line="240" w:lineRule="auto"/>
-        <w:jc w:val="both"/>
-        <w:rPr>
-          <w:rFonts w:ascii="Times New Roman" w:eastAsia="Times New Roman" w:hAnsi="Times New Roman" w:cs="Times New Roman"/>
-          <w:sz w:val="24"/>
-          <w:szCs w:val="24"/>
-        </w:rPr>
-      </w:pPr>
-      <w:r>
-        <w:rPr>
-          <w:rFonts w:ascii="Times New Roman" w:eastAsia="Times New Roman" w:hAnsi="Times New Roman" w:cs="Times New Roman"/>
+        <w:ind w:left="720" w:hanging="360"/>
+        <w:jc w:val="both"/>
+        <w:rPr>
+          <w:rFonts w:ascii="Times New Roman" w:hAnsi="Times New Roman" w:eastAsia="Times New Roman" w:cs="Times New Roman"/>
+          <w:sz w:val="24"/>
+          <w:szCs w:val="24"/>
+        </w:rPr>
+      </w:pPr>
+      <w:r>
+        <w:rPr>
+          <w:rFonts w:ascii="Times New Roman" w:hAnsi="Times New Roman" w:eastAsia="Times New Roman" w:cs="Times New Roman"/>
           <w:b/>
           <w:bCs/>
           <w:sz w:val="24"/>
@@ -1393,7 +1500,7 @@
       </w:r>
       <w:r>
         <w:rPr>
-          <w:rFonts w:ascii="Times New Roman" w:eastAsia="Times New Roman" w:hAnsi="Times New Roman" w:cs="Times New Roman"/>
+          <w:rFonts w:ascii="Times New Roman" w:hAnsi="Times New Roman" w:eastAsia="Times New Roman" w:cs="Times New Roman"/>
           <w:sz w:val="24"/>
           <w:szCs w:val="24"/>
         </w:rPr>
@@ -1407,16 +1514,17 @@
           <w:numId w:val="6"/>
         </w:numPr>
         <w:spacing w:after="0" w:line="240" w:lineRule="auto"/>
-        <w:jc w:val="both"/>
-        <w:rPr>
-          <w:rFonts w:ascii="Times New Roman" w:eastAsia="Times New Roman" w:hAnsi="Times New Roman" w:cs="Times New Roman"/>
-          <w:sz w:val="24"/>
-          <w:szCs w:val="24"/>
-        </w:rPr>
-      </w:pPr>
-      <w:r>
-        <w:rPr>
-          <w:rFonts w:ascii="Times New Roman" w:eastAsia="Times New Roman" w:hAnsi="Times New Roman" w:cs="Times New Roman"/>
+        <w:ind w:left="720" w:hanging="360"/>
+        <w:jc w:val="both"/>
+        <w:rPr>
+          <w:rFonts w:ascii="Times New Roman" w:hAnsi="Times New Roman" w:eastAsia="Times New Roman" w:cs="Times New Roman"/>
+          <w:sz w:val="24"/>
+          <w:szCs w:val="24"/>
+        </w:rPr>
+      </w:pPr>
+      <w:r>
+        <w:rPr>
+          <w:rFonts w:ascii="Times New Roman" w:hAnsi="Times New Roman" w:eastAsia="Times New Roman" w:cs="Times New Roman"/>
           <w:b/>
           <w:bCs/>
           <w:sz w:val="24"/>
@@ -1426,7 +1534,7 @@
       </w:r>
       <w:r>
         <w:rPr>
-          <w:rFonts w:ascii="Times New Roman" w:eastAsia="Times New Roman" w:hAnsi="Times New Roman" w:cs="Times New Roman"/>
+          <w:rFonts w:ascii="Times New Roman" w:hAnsi="Times New Roman" w:eastAsia="Times New Roman" w:cs="Times New Roman"/>
           <w:sz w:val="24"/>
           <w:szCs w:val="24"/>
         </w:rPr>
@@ -1440,16 +1548,17 @@
           <w:numId w:val="6"/>
         </w:numPr>
         <w:spacing w:after="0" w:line="240" w:lineRule="auto"/>
-        <w:jc w:val="both"/>
-        <w:rPr>
-          <w:rFonts w:ascii="Times New Roman" w:eastAsia="Times New Roman" w:hAnsi="Times New Roman" w:cs="Times New Roman"/>
-          <w:sz w:val="24"/>
-          <w:szCs w:val="24"/>
-        </w:rPr>
-      </w:pPr>
-      <w:r>
-        <w:rPr>
-          <w:rFonts w:ascii="Times New Roman" w:eastAsia="Times New Roman" w:hAnsi="Times New Roman" w:cs="Times New Roman"/>
+        <w:ind w:left="720" w:hanging="360"/>
+        <w:jc w:val="both"/>
+        <w:rPr>
+          <w:rFonts w:ascii="Times New Roman" w:hAnsi="Times New Roman" w:eastAsia="Times New Roman" w:cs="Times New Roman"/>
+          <w:sz w:val="24"/>
+          <w:szCs w:val="24"/>
+        </w:rPr>
+      </w:pPr>
+      <w:r>
+        <w:rPr>
+          <w:rFonts w:ascii="Times New Roman" w:hAnsi="Times New Roman" w:eastAsia="Times New Roman" w:cs="Times New Roman"/>
           <w:b/>
           <w:bCs/>
           <w:sz w:val="24"/>
@@ -1459,7 +1568,7 @@
       </w:r>
       <w:r>
         <w:rPr>
-          <w:rFonts w:ascii="Times New Roman" w:eastAsia="Times New Roman" w:hAnsi="Times New Roman" w:cs="Times New Roman"/>
+          <w:rFonts w:ascii="Times New Roman" w:hAnsi="Times New Roman" w:eastAsia="Times New Roman" w:cs="Times New Roman"/>
           <w:sz w:val="24"/>
           <w:szCs w:val="24"/>
         </w:rPr>
@@ -1471,24 +1580,24 @@
         <w:spacing w:after="0" w:line="240" w:lineRule="auto"/>
         <w:jc w:val="both"/>
         <w:rPr>
-          <w:rFonts w:ascii="Times New Roman" w:eastAsia="Times New Roman" w:hAnsi="Times New Roman" w:cs="Times New Roman"/>
-          <w:sz w:val="24"/>
-          <w:szCs w:val="24"/>
-        </w:rPr>
-      </w:pPr>
-    </w:p>
-    <w:p>
-      <w:pPr>
-        <w:spacing w:after="0" w:line="240" w:lineRule="auto"/>
-        <w:rPr>
-          <w:rFonts w:ascii="Times New Roman" w:eastAsia="Times New Roman" w:hAnsi="Times New Roman" w:cs="Times New Roman"/>
-          <w:sz w:val="24"/>
-          <w:szCs w:val="24"/>
-        </w:rPr>
-      </w:pPr>
-      <w:r>
-        <w:rPr>
-          <w:rFonts w:ascii="Times New Roman" w:eastAsia="Times New Roman" w:hAnsi="Times New Roman" w:cs="Times New Roman"/>
+          <w:rFonts w:ascii="Times New Roman" w:hAnsi="Times New Roman" w:eastAsia="Times New Roman" w:cs="Times New Roman"/>
+          <w:sz w:val="24"/>
+          <w:szCs w:val="24"/>
+        </w:rPr>
+      </w:pPr>
+    </w:p>
+    <w:p>
+      <w:pPr>
+        <w:spacing w:after="0" w:line="240" w:lineRule="auto"/>
+        <w:rPr>
+          <w:rFonts w:ascii="Times New Roman" w:hAnsi="Times New Roman" w:eastAsia="Times New Roman" w:cs="Times New Roman"/>
+          <w:sz w:val="24"/>
+          <w:szCs w:val="24"/>
+        </w:rPr>
+      </w:pPr>
+      <w:r>
+        <w:rPr>
+          <w:rFonts w:ascii="Times New Roman" w:hAnsi="Times New Roman" w:eastAsia="Times New Roman" w:cs="Times New Roman"/>
           <w:b/>
           <w:bCs/>
           <w:sz w:val="24"/>
@@ -1505,16 +1614,17 @@
           <w:numId w:val="16"/>
         </w:numPr>
         <w:spacing w:after="0" w:line="240" w:lineRule="auto"/>
-        <w:jc w:val="both"/>
-        <w:rPr>
-          <w:rFonts w:ascii="Times New Roman" w:eastAsia="Times New Roman" w:hAnsi="Times New Roman" w:cs="Times New Roman"/>
-          <w:sz w:val="24"/>
-          <w:szCs w:val="24"/>
-        </w:rPr>
-      </w:pPr>
-      <w:r>
-        <w:rPr>
-          <w:rFonts w:ascii="Times New Roman" w:eastAsia="Times New Roman" w:hAnsi="Times New Roman" w:cs="Times New Roman"/>
+        <w:ind w:left="720" w:hanging="360"/>
+        <w:jc w:val="both"/>
+        <w:rPr>
+          <w:rFonts w:ascii="Times New Roman" w:hAnsi="Times New Roman" w:eastAsia="Times New Roman" w:cs="Times New Roman"/>
+          <w:sz w:val="24"/>
+          <w:szCs w:val="24"/>
+        </w:rPr>
+      </w:pPr>
+      <w:r>
+        <w:rPr>
+          <w:rFonts w:ascii="Times New Roman" w:hAnsi="Times New Roman" w:eastAsia="Times New Roman" w:cs="Times New Roman"/>
           <w:b/>
           <w:bCs/>
           <w:sz w:val="24"/>
@@ -1530,16 +1640,17 @@
           <w:numId w:val="14"/>
         </w:numPr>
         <w:spacing w:after="0" w:line="240" w:lineRule="auto"/>
-        <w:jc w:val="both"/>
-        <w:rPr>
-          <w:rFonts w:ascii="Times New Roman" w:eastAsia="Times New Roman" w:hAnsi="Times New Roman" w:cs="Times New Roman"/>
-          <w:sz w:val="24"/>
-          <w:szCs w:val="24"/>
-        </w:rPr>
-      </w:pPr>
-      <w:r>
-        <w:rPr>
-          <w:rFonts w:ascii="Times New Roman" w:eastAsia="Times New Roman" w:hAnsi="Times New Roman" w:cs="Times New Roman"/>
+        <w:ind w:left="1080" w:hanging="360"/>
+        <w:jc w:val="both"/>
+        <w:rPr>
+          <w:rFonts w:ascii="Times New Roman" w:hAnsi="Times New Roman" w:eastAsia="Times New Roman" w:cs="Times New Roman"/>
+          <w:sz w:val="24"/>
+          <w:szCs w:val="24"/>
+        </w:rPr>
+      </w:pPr>
+      <w:r>
+        <w:rPr>
+          <w:rFonts w:ascii="Times New Roman" w:hAnsi="Times New Roman" w:eastAsia="Times New Roman" w:cs="Times New Roman"/>
           <w:sz w:val="24"/>
           <w:szCs w:val="24"/>
         </w:rPr>
@@ -1553,16 +1664,17 @@
           <w:numId w:val="14"/>
         </w:numPr>
         <w:spacing w:after="0" w:line="240" w:lineRule="auto"/>
-        <w:jc w:val="both"/>
-        <w:rPr>
-          <w:rFonts w:ascii="Times New Roman" w:eastAsia="Times New Roman" w:hAnsi="Times New Roman" w:cs="Times New Roman"/>
-          <w:sz w:val="24"/>
-          <w:szCs w:val="24"/>
-        </w:rPr>
-      </w:pPr>
-      <w:r>
-        <w:rPr>
-          <w:rFonts w:ascii="Times New Roman" w:eastAsia="Times New Roman" w:hAnsi="Times New Roman" w:cs="Times New Roman"/>
+        <w:ind w:left="1080" w:hanging="360"/>
+        <w:jc w:val="both"/>
+        <w:rPr>
+          <w:rFonts w:ascii="Times New Roman" w:hAnsi="Times New Roman" w:eastAsia="Times New Roman" w:cs="Times New Roman"/>
+          <w:sz w:val="24"/>
+          <w:szCs w:val="24"/>
+        </w:rPr>
+      </w:pPr>
+      <w:r>
+        <w:rPr>
+          <w:rFonts w:ascii="Times New Roman" w:hAnsi="Times New Roman" w:eastAsia="Times New Roman" w:cs="Times New Roman"/>
           <w:sz w:val="24"/>
           <w:szCs w:val="24"/>
         </w:rPr>
@@ -1576,16 +1688,17 @@
           <w:numId w:val="14"/>
         </w:numPr>
         <w:spacing w:after="0" w:line="240" w:lineRule="auto"/>
-        <w:jc w:val="both"/>
-        <w:rPr>
-          <w:rFonts w:ascii="Times New Roman" w:eastAsia="Times New Roman" w:hAnsi="Times New Roman" w:cs="Times New Roman"/>
-          <w:sz w:val="24"/>
-          <w:szCs w:val="24"/>
-        </w:rPr>
-      </w:pPr>
-      <w:r>
-        <w:rPr>
-          <w:rFonts w:ascii="Times New Roman" w:eastAsia="Times New Roman" w:hAnsi="Times New Roman" w:cs="Times New Roman"/>
+        <w:ind w:left="1080" w:hanging="360"/>
+        <w:jc w:val="both"/>
+        <w:rPr>
+          <w:rFonts w:ascii="Times New Roman" w:hAnsi="Times New Roman" w:eastAsia="Times New Roman" w:cs="Times New Roman"/>
+          <w:sz w:val="24"/>
+          <w:szCs w:val="24"/>
+        </w:rPr>
+      </w:pPr>
+      <w:r>
+        <w:rPr>
+          <w:rFonts w:ascii="Times New Roman" w:hAnsi="Times New Roman" w:eastAsia="Times New Roman" w:cs="Times New Roman"/>
           <w:sz w:val="24"/>
           <w:szCs w:val="24"/>
         </w:rPr>
@@ -1599,16 +1712,17 @@
           <w:numId w:val="14"/>
         </w:numPr>
         <w:spacing w:after="0" w:line="240" w:lineRule="auto"/>
-        <w:jc w:val="both"/>
-        <w:rPr>
-          <w:rFonts w:ascii="Times New Roman" w:eastAsia="Times New Roman" w:hAnsi="Times New Roman" w:cs="Times New Roman"/>
-          <w:sz w:val="24"/>
-          <w:szCs w:val="24"/>
-        </w:rPr>
-      </w:pPr>
-      <w:r>
-        <w:rPr>
-          <w:rFonts w:ascii="Times New Roman" w:eastAsia="Times New Roman" w:hAnsi="Times New Roman" w:cs="Times New Roman"/>
+        <w:ind w:left="1080" w:hanging="360"/>
+        <w:jc w:val="both"/>
+        <w:rPr>
+          <w:rFonts w:ascii="Times New Roman" w:hAnsi="Times New Roman" w:eastAsia="Times New Roman" w:cs="Times New Roman"/>
+          <w:sz w:val="24"/>
+          <w:szCs w:val="24"/>
+        </w:rPr>
+      </w:pPr>
+      <w:r>
+        <w:rPr>
+          <w:rFonts w:ascii="Times New Roman" w:hAnsi="Times New Roman" w:eastAsia="Times New Roman" w:cs="Times New Roman"/>
           <w:sz w:val="24"/>
           <w:szCs w:val="24"/>
         </w:rPr>
@@ -1621,7 +1735,7 @@
         <w:ind w:left="720"/>
         <w:jc w:val="both"/>
         <w:rPr>
-          <w:rFonts w:ascii="Times New Roman" w:eastAsia="Times New Roman" w:hAnsi="Times New Roman" w:cs="Times New Roman"/>
+          <w:rFonts w:ascii="Times New Roman" w:hAnsi="Times New Roman" w:eastAsia="Times New Roman" w:cs="Times New Roman"/>
           <w:sz w:val="24"/>
           <w:szCs w:val="24"/>
         </w:rPr>
@@ -1635,16 +1749,17 @@
           <w:numId w:val="16"/>
         </w:numPr>
         <w:spacing w:after="0" w:line="240" w:lineRule="auto"/>
-        <w:jc w:val="both"/>
-        <w:rPr>
-          <w:rFonts w:ascii="Times New Roman" w:eastAsia="Times New Roman" w:hAnsi="Times New Roman" w:cs="Times New Roman"/>
-          <w:sz w:val="24"/>
-          <w:szCs w:val="24"/>
-        </w:rPr>
-      </w:pPr>
-      <w:r>
-        <w:rPr>
-          <w:rFonts w:ascii="Times New Roman" w:eastAsia="Times New Roman" w:hAnsi="Times New Roman" w:cs="Times New Roman"/>
+        <w:ind w:left="720" w:hanging="360"/>
+        <w:jc w:val="both"/>
+        <w:rPr>
+          <w:rFonts w:ascii="Times New Roman" w:hAnsi="Times New Roman" w:eastAsia="Times New Roman" w:cs="Times New Roman"/>
+          <w:sz w:val="24"/>
+          <w:szCs w:val="24"/>
+        </w:rPr>
+      </w:pPr>
+      <w:r>
+        <w:rPr>
+          <w:rFonts w:ascii="Times New Roman" w:hAnsi="Times New Roman" w:eastAsia="Times New Roman" w:cs="Times New Roman"/>
           <w:b/>
           <w:bCs/>
           <w:sz w:val="24"/>
@@ -1660,16 +1775,17 @@
           <w:numId w:val="15"/>
         </w:numPr>
         <w:spacing w:after="0" w:line="240" w:lineRule="auto"/>
-        <w:jc w:val="both"/>
-        <w:rPr>
-          <w:rFonts w:ascii="Times New Roman" w:eastAsia="Times New Roman" w:hAnsi="Times New Roman" w:cs="Times New Roman"/>
-          <w:sz w:val="24"/>
-          <w:szCs w:val="24"/>
-        </w:rPr>
-      </w:pPr>
-      <w:r>
-        <w:rPr>
-          <w:rFonts w:ascii="Times New Roman" w:eastAsia="Times New Roman" w:hAnsi="Times New Roman" w:cs="Times New Roman"/>
+        <w:ind w:left="1080" w:hanging="360"/>
+        <w:jc w:val="both"/>
+        <w:rPr>
+          <w:rFonts w:ascii="Times New Roman" w:hAnsi="Times New Roman" w:eastAsia="Times New Roman" w:cs="Times New Roman"/>
+          <w:sz w:val="24"/>
+          <w:szCs w:val="24"/>
+        </w:rPr>
+      </w:pPr>
+      <w:r>
+        <w:rPr>
+          <w:rFonts w:ascii="Times New Roman" w:hAnsi="Times New Roman" w:eastAsia="Times New Roman" w:cs="Times New Roman"/>
           <w:sz w:val="24"/>
           <w:szCs w:val="24"/>
         </w:rPr>
@@ -1683,16 +1799,17 @@
           <w:numId w:val="15"/>
         </w:numPr>
         <w:spacing w:after="0" w:line="240" w:lineRule="auto"/>
-        <w:jc w:val="both"/>
-        <w:rPr>
-          <w:rFonts w:ascii="Times New Roman" w:eastAsia="Times New Roman" w:hAnsi="Times New Roman" w:cs="Times New Roman"/>
-          <w:sz w:val="24"/>
-          <w:szCs w:val="24"/>
-        </w:rPr>
-      </w:pPr>
-      <w:r>
-        <w:rPr>
-          <w:rFonts w:ascii="Times New Roman" w:eastAsia="Times New Roman" w:hAnsi="Times New Roman" w:cs="Times New Roman"/>
+        <w:ind w:left="1080" w:hanging="360"/>
+        <w:jc w:val="both"/>
+        <w:rPr>
+          <w:rFonts w:ascii="Times New Roman" w:hAnsi="Times New Roman" w:eastAsia="Times New Roman" w:cs="Times New Roman"/>
+          <w:sz w:val="24"/>
+          <w:szCs w:val="24"/>
+        </w:rPr>
+      </w:pPr>
+      <w:r>
+        <w:rPr>
+          <w:rFonts w:ascii="Times New Roman" w:hAnsi="Times New Roman" w:eastAsia="Times New Roman" w:cs="Times New Roman"/>
           <w:sz w:val="24"/>
           <w:szCs w:val="24"/>
         </w:rPr>
@@ -1706,16 +1823,17 @@
           <w:numId w:val="15"/>
         </w:numPr>
         <w:spacing w:after="0" w:line="240" w:lineRule="auto"/>
-        <w:jc w:val="both"/>
-        <w:rPr>
-          <w:rFonts w:ascii="Times New Roman" w:eastAsia="Times New Roman" w:hAnsi="Times New Roman" w:cs="Times New Roman"/>
-          <w:sz w:val="24"/>
-          <w:szCs w:val="24"/>
-        </w:rPr>
-      </w:pPr>
-      <w:r>
-        <w:rPr>
-          <w:rFonts w:ascii="Times New Roman" w:eastAsia="Times New Roman" w:hAnsi="Times New Roman" w:cs="Times New Roman"/>
+        <w:ind w:left="1080" w:hanging="360"/>
+        <w:jc w:val="both"/>
+        <w:rPr>
+          <w:rFonts w:ascii="Times New Roman" w:hAnsi="Times New Roman" w:eastAsia="Times New Roman" w:cs="Times New Roman"/>
+          <w:sz w:val="24"/>
+          <w:szCs w:val="24"/>
+        </w:rPr>
+      </w:pPr>
+      <w:r>
+        <w:rPr>
+          <w:rFonts w:ascii="Times New Roman" w:hAnsi="Times New Roman" w:eastAsia="Times New Roman" w:cs="Times New Roman"/>
           <w:sz w:val="24"/>
           <w:szCs w:val="24"/>
         </w:rPr>
@@ -1729,16 +1847,17 @@
           <w:numId w:val="15"/>
         </w:numPr>
         <w:spacing w:after="0" w:line="240" w:lineRule="auto"/>
-        <w:jc w:val="both"/>
-        <w:rPr>
-          <w:rFonts w:ascii="Times New Roman" w:eastAsia="Times New Roman" w:hAnsi="Times New Roman" w:cs="Times New Roman"/>
-          <w:sz w:val="24"/>
-          <w:szCs w:val="24"/>
-        </w:rPr>
-      </w:pPr>
-      <w:r>
-        <w:rPr>
-          <w:rFonts w:ascii="Times New Roman" w:eastAsia="Times New Roman" w:hAnsi="Times New Roman" w:cs="Times New Roman"/>
+        <w:ind w:left="1080" w:hanging="360"/>
+        <w:jc w:val="both"/>
+        <w:rPr>
+          <w:rFonts w:ascii="Times New Roman" w:hAnsi="Times New Roman" w:eastAsia="Times New Roman" w:cs="Times New Roman"/>
+          <w:sz w:val="24"/>
+          <w:szCs w:val="24"/>
+        </w:rPr>
+      </w:pPr>
+      <w:r>
+        <w:rPr>
+          <w:rFonts w:ascii="Times New Roman" w:hAnsi="Times New Roman" w:eastAsia="Times New Roman" w:cs="Times New Roman"/>
           <w:sz w:val="24"/>
           <w:szCs w:val="24"/>
         </w:rPr>
@@ -1750,7 +1869,7 @@
         <w:spacing w:after="0" w:line="240" w:lineRule="auto"/>
         <w:jc w:val="both"/>
         <w:rPr>
-          <w:rFonts w:ascii="Times New Roman" w:eastAsia="Times New Roman" w:hAnsi="Times New Roman" w:cs="Times New Roman"/>
+          <w:rFonts w:ascii="Times New Roman" w:hAnsi="Times New Roman" w:eastAsia="Times New Roman" w:cs="Times New Roman"/>
           <w:sz w:val="24"/>
           <w:szCs w:val="24"/>
         </w:rPr>
@@ -1764,9 +1883,10 @@
           <w:numId w:val="16"/>
         </w:numPr>
         <w:spacing w:after="0" w:line="240" w:lineRule="auto"/>
-        <w:jc w:val="both"/>
-        <w:rPr>
-          <w:rFonts w:ascii="Times New Roman" w:eastAsia="Times New Roman" w:hAnsi="Times New Roman" w:cs="Times New Roman"/>
+        <w:ind w:left="720" w:hanging="360"/>
+        <w:jc w:val="both"/>
+        <w:rPr>
+          <w:rFonts w:ascii="Times New Roman" w:hAnsi="Times New Roman" w:eastAsia="Times New Roman" w:cs="Times New Roman"/>
           <w:b/>
           <w:bCs/>
           <w:sz w:val="24"/>
@@ -1775,7 +1895,7 @@
       </w:pPr>
       <w:r>
         <w:rPr>
-          <w:rFonts w:ascii="Times New Roman" w:eastAsia="Times New Roman" w:hAnsi="Times New Roman" w:cs="Times New Roman"/>
+          <w:rFonts w:ascii="Times New Roman" w:hAnsi="Times New Roman" w:eastAsia="Times New Roman" w:cs="Times New Roman"/>
           <w:b/>
           <w:bCs/>
           <w:sz w:val="24"/>
@@ -1791,16 +1911,17 @@
           <w:numId w:val="15"/>
         </w:numPr>
         <w:spacing w:after="0" w:line="240" w:lineRule="auto"/>
-        <w:jc w:val="both"/>
-        <w:rPr>
-          <w:rFonts w:ascii="Times New Roman" w:eastAsia="Times New Roman" w:hAnsi="Times New Roman" w:cs="Times New Roman"/>
-          <w:sz w:val="24"/>
-          <w:szCs w:val="24"/>
-        </w:rPr>
-      </w:pPr>
-      <w:r>
-        <w:rPr>
-          <w:rFonts w:ascii="Times New Roman" w:eastAsia="Times New Roman" w:hAnsi="Times New Roman" w:cs="Times New Roman"/>
+        <w:ind w:left="1080" w:hanging="360"/>
+        <w:jc w:val="both"/>
+        <w:rPr>
+          <w:rFonts w:ascii="Times New Roman" w:hAnsi="Times New Roman" w:eastAsia="Times New Roman" w:cs="Times New Roman"/>
+          <w:sz w:val="24"/>
+          <w:szCs w:val="24"/>
+        </w:rPr>
+      </w:pPr>
+      <w:r>
+        <w:rPr>
+          <w:rFonts w:ascii="Times New Roman" w:hAnsi="Times New Roman" w:eastAsia="Times New Roman" w:cs="Times New Roman"/>
           <w:sz w:val="24"/>
           <w:szCs w:val="24"/>
         </w:rPr>
@@ -1808,7 +1929,7 @@
       </w:r>
       <w:r>
         <w:rPr>
-          <w:rFonts w:ascii="Times New Roman" w:eastAsia="Times New Roman" w:hAnsi="Times New Roman" w:cs="Times New Roman"/>
+          <w:rFonts w:ascii="Times New Roman" w:hAnsi="Times New Roman" w:eastAsia="Times New Roman" w:cs="Times New Roman"/>
           <w:sz w:val="24"/>
           <w:szCs w:val="24"/>
         </w:rPr>
@@ -1822,16 +1943,17 @@
           <w:numId w:val="15"/>
         </w:numPr>
         <w:spacing w:after="0" w:line="240" w:lineRule="auto"/>
-        <w:jc w:val="both"/>
-        <w:rPr>
-          <w:rFonts w:ascii="Times New Roman" w:eastAsia="Times New Roman" w:hAnsi="Times New Roman" w:cs="Times New Roman"/>
-          <w:sz w:val="24"/>
-          <w:szCs w:val="24"/>
-        </w:rPr>
-      </w:pPr>
-      <w:r>
-        <w:rPr>
-          <w:rFonts w:ascii="Times New Roman" w:eastAsia="Times New Roman" w:hAnsi="Times New Roman" w:cs="Times New Roman"/>
+        <w:ind w:left="1080" w:hanging="360"/>
+        <w:jc w:val="both"/>
+        <w:rPr>
+          <w:rFonts w:ascii="Times New Roman" w:hAnsi="Times New Roman" w:eastAsia="Times New Roman" w:cs="Times New Roman"/>
+          <w:sz w:val="24"/>
+          <w:szCs w:val="24"/>
+        </w:rPr>
+      </w:pPr>
+      <w:r>
+        <w:rPr>
+          <w:rFonts w:ascii="Times New Roman" w:hAnsi="Times New Roman" w:eastAsia="Times New Roman" w:cs="Times New Roman"/>
           <w:sz w:val="24"/>
           <w:szCs w:val="24"/>
         </w:rPr>
@@ -1839,7 +1961,7 @@
       </w:r>
       <w:r>
         <w:rPr>
-          <w:rFonts w:ascii="Times New Roman" w:eastAsia="Times New Roman" w:hAnsi="Times New Roman" w:cs="Times New Roman"/>
+          <w:rFonts w:ascii="Times New Roman" w:hAnsi="Times New Roman" w:eastAsia="Times New Roman" w:cs="Times New Roman"/>
           <w:sz w:val="24"/>
           <w:szCs w:val="24"/>
         </w:rPr>
@@ -1847,7 +1969,7 @@
       </w:r>
       <w:r>
         <w:rPr>
-          <w:rFonts w:ascii="Times New Roman" w:eastAsia="Times New Roman" w:hAnsi="Times New Roman" w:cs="Times New Roman"/>
+          <w:rFonts w:ascii="Times New Roman" w:hAnsi="Times New Roman" w:eastAsia="Times New Roman" w:cs="Times New Roman"/>
           <w:sz w:val="24"/>
           <w:szCs w:val="24"/>
         </w:rPr>
@@ -1855,7 +1977,7 @@
       </w:r>
       <w:r>
         <w:rPr>
-          <w:rFonts w:ascii="Times New Roman" w:eastAsia="Times New Roman" w:hAnsi="Times New Roman" w:cs="Times New Roman"/>
+          <w:rFonts w:ascii="Times New Roman" w:hAnsi="Times New Roman" w:eastAsia="Times New Roman" w:cs="Times New Roman"/>
           <w:sz w:val="24"/>
           <w:szCs w:val="24"/>
         </w:rPr>
@@ -1869,16 +1991,17 @@
           <w:numId w:val="15"/>
         </w:numPr>
         <w:spacing w:after="0" w:line="240" w:lineRule="auto"/>
-        <w:jc w:val="both"/>
-        <w:rPr>
-          <w:rFonts w:ascii="Times New Roman" w:eastAsia="Times New Roman" w:hAnsi="Times New Roman" w:cs="Times New Roman"/>
-          <w:sz w:val="24"/>
-          <w:szCs w:val="24"/>
-        </w:rPr>
-      </w:pPr>
-      <w:r>
-        <w:rPr>
-          <w:rFonts w:ascii="Times New Roman" w:eastAsia="Times New Roman" w:hAnsi="Times New Roman" w:cs="Times New Roman"/>
+        <w:ind w:left="1080" w:hanging="360"/>
+        <w:jc w:val="both"/>
+        <w:rPr>
+          <w:rFonts w:ascii="Times New Roman" w:hAnsi="Times New Roman" w:eastAsia="Times New Roman" w:cs="Times New Roman"/>
+          <w:sz w:val="24"/>
+          <w:szCs w:val="24"/>
+        </w:rPr>
+      </w:pPr>
+      <w:r>
+        <w:rPr>
+          <w:rFonts w:ascii="Times New Roman" w:hAnsi="Times New Roman" w:eastAsia="Times New Roman" w:cs="Times New Roman"/>
           <w:sz w:val="24"/>
           <w:szCs w:val="24"/>
         </w:rPr>
@@ -1886,7 +2009,7 @@
       </w:r>
       <w:r>
         <w:rPr>
-          <w:rFonts w:ascii="Times New Roman" w:eastAsia="Times New Roman" w:hAnsi="Times New Roman" w:cs="Times New Roman"/>
+          <w:rFonts w:ascii="Times New Roman" w:hAnsi="Times New Roman" w:eastAsia="Times New Roman" w:cs="Times New Roman"/>
           <w:sz w:val="24"/>
           <w:szCs w:val="24"/>
         </w:rPr>
@@ -1894,7 +2017,7 @@
       </w:r>
       <w:r>
         <w:rPr>
-          <w:rFonts w:ascii="Times New Roman" w:eastAsia="Times New Roman" w:hAnsi="Times New Roman" w:cs="Times New Roman"/>
+          <w:rFonts w:ascii="Times New Roman" w:hAnsi="Times New Roman" w:eastAsia="Times New Roman" w:cs="Times New Roman"/>
           <w:sz w:val="24"/>
           <w:szCs w:val="24"/>
         </w:rPr>
@@ -1902,7 +2025,7 @@
       </w:r>
       <w:r>
         <w:rPr>
-          <w:rFonts w:ascii="Times New Roman" w:eastAsia="Times New Roman" w:hAnsi="Times New Roman" w:cs="Times New Roman"/>
+          <w:rFonts w:ascii="Times New Roman" w:hAnsi="Times New Roman" w:eastAsia="Times New Roman" w:cs="Times New Roman"/>
           <w:sz w:val="24"/>
           <w:szCs w:val="24"/>
         </w:rPr>
@@ -1910,7 +2033,7 @@
       </w:r>
       <w:r>
         <w:rPr>
-          <w:rFonts w:ascii="Times New Roman" w:eastAsia="Times New Roman" w:hAnsi="Times New Roman" w:cs="Times New Roman"/>
+          <w:rFonts w:ascii="Times New Roman" w:hAnsi="Times New Roman" w:eastAsia="Times New Roman" w:cs="Times New Roman"/>
           <w:sz w:val="24"/>
           <w:szCs w:val="24"/>
         </w:rPr>
@@ -1918,7 +2041,7 @@
       </w:r>
       <w:r>
         <w:rPr>
-          <w:rFonts w:ascii="Times New Roman" w:eastAsia="Times New Roman" w:hAnsi="Times New Roman" w:cs="Times New Roman"/>
+          <w:rFonts w:ascii="Times New Roman" w:hAnsi="Times New Roman" w:eastAsia="Times New Roman" w:cs="Times New Roman"/>
           <w:sz w:val="24"/>
           <w:szCs w:val="24"/>
         </w:rPr>
@@ -1932,16 +2055,17 @@
           <w:numId w:val="15"/>
         </w:numPr>
         <w:spacing w:after="0" w:line="240" w:lineRule="auto"/>
-        <w:jc w:val="both"/>
-        <w:rPr>
-          <w:rFonts w:ascii="Times New Roman" w:eastAsia="Times New Roman" w:hAnsi="Times New Roman" w:cs="Times New Roman"/>
-          <w:sz w:val="24"/>
-          <w:szCs w:val="24"/>
-        </w:rPr>
-      </w:pPr>
-      <w:r>
-        <w:rPr>
-          <w:rFonts w:ascii="Times New Roman" w:eastAsia="Times New Roman" w:hAnsi="Times New Roman" w:cs="Times New Roman"/>
+        <w:ind w:left="1080" w:hanging="360"/>
+        <w:jc w:val="both"/>
+        <w:rPr>
+          <w:rFonts w:ascii="Times New Roman" w:hAnsi="Times New Roman" w:eastAsia="Times New Roman" w:cs="Times New Roman"/>
+          <w:sz w:val="24"/>
+          <w:szCs w:val="24"/>
+        </w:rPr>
+      </w:pPr>
+      <w:r>
+        <w:rPr>
+          <w:rFonts w:ascii="Times New Roman" w:hAnsi="Times New Roman" w:eastAsia="Times New Roman" w:cs="Times New Roman"/>
           <w:sz w:val="24"/>
           <w:szCs w:val="24"/>
         </w:rPr>
@@ -1949,7 +2073,7 @@
       </w:r>
       <w:r>
         <w:rPr>
-          <w:rFonts w:ascii="Times New Roman" w:eastAsia="Times New Roman" w:hAnsi="Times New Roman" w:cs="Times New Roman"/>
+          <w:rFonts w:ascii="Times New Roman" w:hAnsi="Times New Roman" w:eastAsia="Times New Roman" w:cs="Times New Roman"/>
           <w:sz w:val="24"/>
           <w:szCs w:val="24"/>
         </w:rPr>
@@ -1957,7 +2081,7 @@
       </w:r>
       <w:r>
         <w:rPr>
-          <w:rFonts w:ascii="Times New Roman" w:eastAsia="Times New Roman" w:hAnsi="Times New Roman" w:cs="Times New Roman"/>
+          <w:rFonts w:ascii="Times New Roman" w:hAnsi="Times New Roman" w:eastAsia="Times New Roman" w:cs="Times New Roman"/>
           <w:sz w:val="24"/>
           <w:szCs w:val="24"/>
         </w:rPr>
@@ -1965,7 +2089,7 @@
       </w:r>
       <w:r>
         <w:rPr>
-          <w:rFonts w:ascii="Times New Roman" w:eastAsia="Times New Roman" w:hAnsi="Times New Roman" w:cs="Times New Roman"/>
+          <w:rFonts w:ascii="Times New Roman" w:hAnsi="Times New Roman" w:eastAsia="Times New Roman" w:cs="Times New Roman"/>
           <w:sz w:val="24"/>
           <w:szCs w:val="24"/>
         </w:rPr>
@@ -1973,7 +2097,7 @@
       </w:r>
       <w:r>
         <w:rPr>
-          <w:rFonts w:ascii="Times New Roman" w:eastAsia="Times New Roman" w:hAnsi="Times New Roman" w:cs="Times New Roman"/>
+          <w:rFonts w:ascii="Times New Roman" w:hAnsi="Times New Roman" w:eastAsia="Times New Roman" w:cs="Times New Roman"/>
           <w:sz w:val="24"/>
           <w:szCs w:val="24"/>
         </w:rPr>
@@ -1981,7 +2105,7 @@
       </w:r>
       <w:r>
         <w:rPr>
-          <w:rFonts w:ascii="Times New Roman" w:eastAsia="Times New Roman" w:hAnsi="Times New Roman" w:cs="Times New Roman"/>
+          <w:rFonts w:ascii="Times New Roman" w:hAnsi="Times New Roman" w:eastAsia="Times New Roman" w:cs="Times New Roman"/>
           <w:sz w:val="24"/>
           <w:szCs w:val="24"/>
         </w:rPr>
@@ -1993,17 +2117,17 @@
         <w:spacing w:after="0" w:line="240" w:lineRule="auto"/>
         <w:jc w:val="both"/>
         <w:rPr>
-          <w:rFonts w:ascii="Times New Roman" w:eastAsia="Times New Roman" w:hAnsi="Times New Roman" w:cs="Times New Roman"/>
-          <w:sz w:val="24"/>
-          <w:szCs w:val="24"/>
-        </w:rPr>
-      </w:pPr>
-    </w:p>
-    <w:p>
-      <w:pPr>
-        <w:spacing w:after="0" w:line="240" w:lineRule="auto"/>
-        <w:rPr>
-          <w:rFonts w:ascii="Times New Roman" w:eastAsia="Times New Roman" w:hAnsi="Times New Roman" w:cs="Times New Roman"/>
+          <w:rFonts w:ascii="Times New Roman" w:hAnsi="Times New Roman" w:eastAsia="Times New Roman" w:cs="Times New Roman"/>
+          <w:sz w:val="24"/>
+          <w:szCs w:val="24"/>
+        </w:rPr>
+      </w:pPr>
+    </w:p>
+    <w:p>
+      <w:pPr>
+        <w:spacing w:after="0" w:line="240" w:lineRule="auto"/>
+        <w:rPr>
+          <w:rFonts w:ascii="Times New Roman" w:hAnsi="Times New Roman" w:eastAsia="Times New Roman" w:cs="Times New Roman"/>
           <w:b/>
           <w:bCs/>
           <w:sz w:val="24"/>
@@ -2012,7 +2136,7 @@
       </w:pPr>
       <w:r>
         <w:rPr>
-          <w:rFonts w:ascii="Times New Roman" w:eastAsia="Times New Roman" w:hAnsi="Times New Roman" w:cs="Times New Roman"/>
+          <w:rFonts w:ascii="Times New Roman" w:hAnsi="Times New Roman" w:eastAsia="Times New Roman" w:cs="Times New Roman"/>
           <w:b/>
           <w:bCs/>
           <w:sz w:val="24"/>
@@ -2024,281 +2148,58 @@
     <w:p>
       <w:pPr>
         <w:pStyle w:val="ListParagraph"/>
-        <w:numPr>
-          <w:ilvl w:val="0"/>
-          <w:numId w:val="20"/>
-        </w:numPr>
-        <w:spacing w:after="0" w:line="240" w:lineRule="auto"/>
-        <w:jc w:val="both"/>
-        <w:rPr>
-          <w:rFonts w:ascii="Times New Roman" w:eastAsia="Times New Roman" w:hAnsi="Times New Roman" w:cs="Times New Roman"/>
-          <w:sz w:val="24"/>
-          <w:szCs w:val="24"/>
-        </w:rPr>
-      </w:pPr>
-      <w:r>
-        <w:rPr>
-          <w:rFonts w:ascii="Times New Roman" w:eastAsia="Times New Roman" w:hAnsi="Times New Roman" w:cs="Times New Roman"/>
+        <w:spacing w:after="0" w:line="240" w:lineRule="auto"/>
+        <w:ind w:left="720" w:hanging="360"/>
+        <w:jc w:val="both"/>
+        <w:rPr>
+          <w:rFonts w:ascii="Times New Roman" w:hAnsi="Times New Roman" w:eastAsia="Times New Roman" w:cs="Times New Roman"/>
+          <w:sz w:val="24"/>
+          <w:szCs w:val="24"/>
+        </w:rPr>
+      </w:pPr>
+      <w:r>
+        <w:rPr>
+          <w:rFonts w:ascii="Times New Roman" w:hAnsi="Times New Roman" w:eastAsia="Times New Roman" w:cs="Times New Roman"/>
           <w:b/>
           <w:bCs/>
           <w:sz w:val="24"/>
           <w:szCs w:val="24"/>
         </w:rPr>
-        <w:t>Biaya Awal</w:t>
-      </w:r>
-      <w:r>
-        <w:rPr>
-          <w:rFonts w:ascii="Times New Roman" w:eastAsia="Times New Roman" w:hAnsi="Times New Roman" w:cs="Times New Roman"/>
-          <w:sz w:val="24"/>
-          <w:szCs w:val="24"/>
-        </w:rPr>
-        <w:t>:</w:t>
-      </w:r>
-    </w:p>
-    <w:p>
-      <w:pPr>
-        <w:numPr>
-          <w:ilvl w:val="0"/>
-          <w:numId w:val="17"/>
-        </w:numPr>
-        <w:spacing w:after="0" w:line="240" w:lineRule="auto"/>
-        <w:jc w:val="both"/>
-        <w:rPr>
-          <w:rFonts w:ascii="Times New Roman" w:eastAsia="Times New Roman" w:hAnsi="Times New Roman" w:cs="Times New Roman"/>
-          <w:sz w:val="24"/>
-          <w:szCs w:val="24"/>
-        </w:rPr>
-      </w:pPr>
-      <w:r>
-        <w:rPr>
-          <w:rFonts w:ascii="Times New Roman" w:eastAsia="Times New Roman" w:hAnsi="Times New Roman" w:cs="Times New Roman"/>
-          <w:sz w:val="24"/>
-          <w:szCs w:val="24"/>
-        </w:rPr>
-        <w:t xml:space="preserve">Biaya Pendaftaran </w:t>
-      </w:r>
-    </w:p>
-    <w:p>
-      <w:pPr>
-        <w:numPr>
-          <w:ilvl w:val="0"/>
-          <w:numId w:val="17"/>
-        </w:numPr>
-        <w:spacing w:after="0" w:line="240" w:lineRule="auto"/>
-        <w:jc w:val="both"/>
-        <w:rPr>
-          <w:rFonts w:ascii="Times New Roman" w:eastAsia="Times New Roman" w:hAnsi="Times New Roman" w:cs="Times New Roman"/>
-          <w:sz w:val="24"/>
-          <w:szCs w:val="24"/>
-        </w:rPr>
-      </w:pPr>
-      <w:r>
-        <w:rPr>
-          <w:rFonts w:ascii="Times New Roman" w:eastAsia="Times New Roman" w:hAnsi="Times New Roman" w:cs="Times New Roman"/>
-          <w:sz w:val="24"/>
-          <w:szCs w:val="24"/>
-        </w:rPr>
-        <w:t xml:space="preserve">Jas Almamater </w:t>
-      </w:r>
-    </w:p>
-    <w:p>
-      <w:pPr>
-        <w:numPr>
-          <w:ilvl w:val="0"/>
-          <w:numId w:val="17"/>
-        </w:numPr>
-        <w:spacing w:after="0" w:line="240" w:lineRule="auto"/>
-        <w:jc w:val="both"/>
-        <w:rPr>
-          <w:rFonts w:ascii="Times New Roman" w:eastAsia="Times New Roman" w:hAnsi="Times New Roman" w:cs="Times New Roman"/>
-          <w:sz w:val="24"/>
-          <w:szCs w:val="24"/>
-        </w:rPr>
-      </w:pPr>
-      <w:r>
-        <w:rPr>
-          <w:rFonts w:ascii="Times New Roman" w:eastAsia="Times New Roman" w:hAnsi="Times New Roman" w:cs="Times New Roman"/>
-          <w:sz w:val="24"/>
-          <w:szCs w:val="24"/>
-        </w:rPr>
-        <w:t xml:space="preserve">Kartu Tanda Mahasiswa </w:t>
-      </w:r>
-    </w:p>
-    <w:p>
-      <w:pPr>
-        <w:numPr>
-          <w:ilvl w:val="0"/>
-          <w:numId w:val="17"/>
-        </w:numPr>
-        <w:spacing w:after="0" w:line="240" w:lineRule="auto"/>
-        <w:jc w:val="both"/>
-        <w:rPr>
-          <w:rFonts w:ascii="Times New Roman" w:eastAsia="Times New Roman" w:hAnsi="Times New Roman" w:cs="Times New Roman"/>
-          <w:sz w:val="24"/>
-          <w:szCs w:val="24"/>
-        </w:rPr>
-      </w:pPr>
-      <w:r>
-        <w:rPr>
-          <w:rFonts w:ascii="Times New Roman" w:eastAsia="Times New Roman" w:hAnsi="Times New Roman" w:cs="Times New Roman"/>
-          <w:sz w:val="24"/>
-          <w:szCs w:val="24"/>
-        </w:rPr>
-        <w:t xml:space="preserve">Orientasi Kampus </w:t>
-      </w:r>
-    </w:p>
-    <w:p>
-      <w:pPr>
-        <w:numPr>
-          <w:ilvl w:val="0"/>
-          <w:numId w:val="17"/>
-        </w:numPr>
-        <w:spacing w:after="0" w:line="240" w:lineRule="auto"/>
-        <w:jc w:val="both"/>
-        <w:rPr>
-          <w:rFonts w:ascii="Times New Roman" w:eastAsia="Times New Roman" w:hAnsi="Times New Roman" w:cs="Times New Roman"/>
-          <w:sz w:val="24"/>
-          <w:szCs w:val="24"/>
-        </w:rPr>
-      </w:pPr>
-      <w:r>
-        <w:rPr>
-          <w:rFonts w:ascii="Times New Roman" w:eastAsia="Times New Roman" w:hAnsi="Times New Roman" w:cs="Times New Roman"/>
-          <w:sz w:val="24"/>
-          <w:szCs w:val="24"/>
-        </w:rPr>
-        <w:t xml:space="preserve">Uang Bangunan </w:t>
-      </w:r>
-    </w:p>
-    <w:p>
-      <w:pPr>
-        <w:spacing w:after="0" w:line="240" w:lineRule="auto"/>
-        <w:ind w:left="720"/>
-        <w:jc w:val="both"/>
-        <w:rPr>
-          <w:rFonts w:ascii="Times New Roman" w:eastAsia="Times New Roman" w:hAnsi="Times New Roman" w:cs="Times New Roman"/>
-          <w:sz w:val="24"/>
-          <w:szCs w:val="24"/>
-        </w:rPr>
-      </w:pPr>
-      <w:r>
-        <w:rPr>
-          <w:rFonts w:ascii="Times New Roman" w:eastAsia="Times New Roman" w:hAnsi="Times New Roman" w:cs="Times New Roman"/>
+        <w:t>Rincian Biaya per Semester</w:t>
+      </w:r>
+      <w:r>
+        <w:rPr>
+          <w:rFonts w:ascii="Times New Roman" w:hAnsi="Times New Roman" w:eastAsia="Times New Roman" w:cs="Times New Roman"/>
           <w:b/>
           <w:bCs/>
           <w:sz w:val="24"/>
           <w:szCs w:val="24"/>
         </w:rPr>
-        <w:t>Keterangan</w:t>
-      </w:r>
-      <w:r>
-        <w:rPr>
-          <w:rFonts w:ascii="Times New Roman" w:eastAsia="Times New Roman" w:hAnsi="Times New Roman" w:cs="Times New Roman"/>
-          <w:sz w:val="24"/>
-          <w:szCs w:val="24"/>
-        </w:rPr>
-        <w:t>: Dibayarkan 1 kali di awal</w:t>
-      </w:r>
-    </w:p>
-    <w:p>
-      <w:pPr>
-        <w:spacing w:after="0" w:line="240" w:lineRule="auto"/>
-        <w:ind w:left="720"/>
-        <w:jc w:val="both"/>
-        <w:rPr>
-          <w:rFonts w:ascii="Times New Roman" w:eastAsia="Times New Roman" w:hAnsi="Times New Roman" w:cs="Times New Roman"/>
-          <w:sz w:val="24"/>
-          <w:szCs w:val="24"/>
-        </w:rPr>
-      </w:pPr>
-      <w:r>
-        <w:rPr>
-          <w:rFonts w:ascii="Times New Roman" w:eastAsia="Times New Roman" w:hAnsi="Times New Roman" w:cs="Times New Roman"/>
+        <w:t xml:space="preserve"> </w:t>
+      </w:r>
+      <w:r>
+        <w:rPr>
+          <w:rFonts w:ascii="Times New Roman" w:hAnsi="Times New Roman" w:eastAsia="Times New Roman" w:cs="Times New Roman"/>
           <w:b/>
           <w:bCs/>
           <w:sz w:val="24"/>
           <w:szCs w:val="24"/>
         </w:rPr>
-        <w:t>Jumlah</w:t>
-      </w:r>
-      <w:r>
-        <w:rPr>
-          <w:rFonts w:ascii="Times New Roman" w:eastAsia="Times New Roman" w:hAnsi="Times New Roman" w:cs="Times New Roman"/>
-          <w:sz w:val="24"/>
-          <w:szCs w:val="24"/>
-        </w:rPr>
-        <w:t xml:space="preserve">: Rp2.750.000 </w:t>
-      </w:r>
-    </w:p>
-    <w:p>
-      <w:pPr>
-        <w:spacing w:after="0" w:line="240" w:lineRule="auto"/>
-        <w:jc w:val="both"/>
-        <w:rPr>
-          <w:rFonts w:ascii="Times New Roman" w:eastAsia="Times New Roman" w:hAnsi="Times New Roman" w:cs="Times New Roman"/>
-          <w:sz w:val="24"/>
-          <w:szCs w:val="24"/>
-        </w:rPr>
-      </w:pPr>
-    </w:p>
-    <w:p>
-      <w:pPr>
-        <w:pStyle w:val="ListParagraph"/>
-        <w:numPr>
-          <w:ilvl w:val="0"/>
-          <w:numId w:val="20"/>
-        </w:numPr>
-        <w:spacing w:after="0" w:line="240" w:lineRule="auto"/>
-        <w:jc w:val="both"/>
-        <w:rPr>
-          <w:rFonts w:ascii="Times New Roman" w:eastAsia="Times New Roman" w:hAnsi="Times New Roman" w:cs="Times New Roman"/>
-          <w:sz w:val="24"/>
-          <w:szCs w:val="24"/>
-        </w:rPr>
-      </w:pPr>
-      <w:r>
-        <w:rPr>
-          <w:rFonts w:ascii="Times New Roman" w:eastAsia="Times New Roman" w:hAnsi="Times New Roman" w:cs="Times New Roman"/>
+        <w:t>(Bisa Dicicil per Bulan</w:t>
+      </w:r>
+      <w:r>
+        <w:rPr>
+          <w:rFonts w:ascii="Times New Roman" w:hAnsi="Times New Roman" w:eastAsia="Times New Roman" w:cs="Times New Roman"/>
           <w:b/>
           <w:bCs/>
           <w:sz w:val="24"/>
           <w:szCs w:val="24"/>
         </w:rPr>
-        <w:t>Rincian Biaya per Semester</w:t>
-      </w:r>
-      <w:r>
-        <w:rPr>
-          <w:rFonts w:ascii="Times New Roman" w:eastAsia="Times New Roman" w:hAnsi="Times New Roman" w:cs="Times New Roman"/>
-          <w:b/>
-          <w:bCs/>
-          <w:sz w:val="24"/>
-          <w:szCs w:val="24"/>
-        </w:rPr>
-        <w:t xml:space="preserve"> </w:t>
-      </w:r>
-      <w:r>
-        <w:rPr>
-          <w:rFonts w:ascii="Times New Roman" w:eastAsia="Times New Roman" w:hAnsi="Times New Roman" w:cs="Times New Roman"/>
-          <w:b/>
-          <w:bCs/>
-          <w:sz w:val="24"/>
-          <w:szCs w:val="24"/>
-        </w:rPr>
-        <w:t>(Bisa Dicicil per Bulan</w:t>
-      </w:r>
-      <w:r>
-        <w:rPr>
-          <w:rFonts w:ascii="Times New Roman" w:eastAsia="Times New Roman" w:hAnsi="Times New Roman" w:cs="Times New Roman"/>
-          <w:b/>
-          <w:bCs/>
-          <w:sz w:val="24"/>
-          <w:szCs w:val="24"/>
-        </w:rPr>
         <w:t>)</w:t>
       </w:r>
       <w:r>
         <w:rPr>
-          <w:rFonts w:ascii="Times New Roman" w:eastAsia="Times New Roman" w:hAnsi="Times New Roman" w:cs="Times New Roman"/>
+          <w:rFonts w:ascii="Times New Roman" w:hAnsi="Times New Roman" w:eastAsia="Times New Roman" w:cs="Times New Roman"/>
           <w:b/>
           <w:bCs/>
           <w:sz w:val="24"/>
@@ -2314,72 +2215,49 @@
           <w:numId w:val="19"/>
         </w:numPr>
         <w:spacing w:after="0" w:line="240" w:lineRule="auto"/>
-        <w:jc w:val="both"/>
-        <w:rPr>
-          <w:rFonts w:ascii="Times New Roman" w:eastAsia="Times New Roman" w:hAnsi="Times New Roman" w:cs="Times New Roman"/>
-          <w:sz w:val="24"/>
-          <w:szCs w:val="24"/>
-        </w:rPr>
-      </w:pPr>
-      <w:r>
-        <w:rPr>
-          <w:rFonts w:ascii="Times New Roman" w:eastAsia="Times New Roman" w:hAnsi="Times New Roman" w:cs="Times New Roman"/>
+        <w:ind w:left="1080" w:hanging="360"/>
+        <w:jc w:val="both"/>
+        <w:rPr>
+          <w:rFonts w:ascii="Times New Roman" w:hAnsi="Times New Roman" w:eastAsia="Times New Roman" w:cs="Times New Roman"/>
+          <w:sz w:val="24"/>
+          <w:szCs w:val="24"/>
+        </w:rPr>
+      </w:pPr>
+      <w:r>
+        <w:rPr>
+          <w:rFonts w:ascii="Times New Roman" w:hAnsi="Times New Roman" w:eastAsia="Times New Roman" w:cs="Times New Roman"/>
           <w:b/>
           <w:bCs/>
           <w:sz w:val="24"/>
           <w:szCs w:val="24"/>
         </w:rPr>
-        <w:t xml:space="preserve">Biaya di </w:t>
-      </w:r>
-      <w:r>
-        <w:rPr>
-          <w:rFonts w:ascii="Times New Roman" w:eastAsia="Times New Roman" w:hAnsi="Times New Roman" w:cs="Times New Roman"/>
+        <w:t>Biaya di Semester I</w:t>
+      </w:r>
+      <w:r>
+        <w:rPr>
+          <w:rFonts w:ascii="Times New Roman" w:hAnsi="Times New Roman" w:eastAsia="Times New Roman" w:cs="Times New Roman"/>
+          <w:sz w:val="24"/>
+          <w:szCs w:val="24"/>
+        </w:rPr>
+        <w:t xml:space="preserve">: Rp3.000.000 + </w:t>
+      </w:r>
+      <w:r>
+        <w:rPr>
+          <w:rFonts w:ascii="Times New Roman" w:hAnsi="Times New Roman" w:eastAsia="Times New Roman" w:cs="Times New Roman"/>
           <w:b/>
           <w:bCs/>
           <w:sz w:val="24"/>
           <w:szCs w:val="24"/>
         </w:rPr>
-        <w:t>Semester I</w:t>
-      </w:r>
-      <w:r>
-        <w:rPr>
-          <w:rFonts w:ascii="Times New Roman" w:eastAsia="Times New Roman" w:hAnsi="Times New Roman" w:cs="Times New Roman"/>
-          <w:sz w:val="24"/>
-          <w:szCs w:val="24"/>
-        </w:rPr>
-        <w:t>: Rp</w:t>
-      </w:r>
-      <w:r>
-        <w:rPr>
-          <w:rFonts w:ascii="Times New Roman" w:eastAsia="Times New Roman" w:hAnsi="Times New Roman" w:cs="Times New Roman"/>
-          <w:sz w:val="24"/>
-          <w:szCs w:val="24"/>
-        </w:rPr>
-        <w:t xml:space="preserve">3.000.000 + </w:t>
-      </w:r>
-      <w:r>
-        <w:rPr>
-          <w:rFonts w:ascii="Times New Roman" w:eastAsia="Times New Roman" w:hAnsi="Times New Roman" w:cs="Times New Roman"/>
-          <w:sz w:val="24"/>
-          <w:szCs w:val="24"/>
-        </w:rPr>
-        <w:t xml:space="preserve">Rp2.750.000 </w:t>
-      </w:r>
-      <w:r>
-        <w:rPr>
-          <w:rFonts w:ascii="Times New Roman" w:eastAsia="Times New Roman" w:hAnsi="Times New Roman" w:cs="Times New Roman"/>
-          <w:sz w:val="24"/>
-          <w:szCs w:val="24"/>
-        </w:rPr>
-        <w:t>= Rp</w:t>
-      </w:r>
-      <w:r>
-        <w:rPr>
-          <w:rFonts w:ascii="Times New Roman" w:eastAsia="Times New Roman" w:hAnsi="Times New Roman" w:cs="Times New Roman"/>
-          <w:sz w:val="24"/>
-          <w:szCs w:val="24"/>
-        </w:rPr>
-        <w:t xml:space="preserve">5.750.000 </w:t>
+        <w:t>Biaya Awal</w:t>
+      </w:r>
+      <w:r>
+        <w:rPr>
+          <w:rFonts w:ascii="Times New Roman" w:hAnsi="Times New Roman" w:eastAsia="Times New Roman" w:cs="Times New Roman"/>
+          <w:sz w:val="24"/>
+          <w:szCs w:val="24"/>
+        </w:rPr>
+        <w:t xml:space="preserve"> Rp2.750.000 = Rp5.750.000 </w:t>
       </w:r>
     </w:p>
     <w:p>
@@ -2389,16 +2267,17 @@
           <w:numId w:val="19"/>
         </w:numPr>
         <w:spacing w:after="0" w:line="240" w:lineRule="auto"/>
-        <w:jc w:val="both"/>
-        <w:rPr>
-          <w:rFonts w:ascii="Times New Roman" w:eastAsia="Times New Roman" w:hAnsi="Times New Roman" w:cs="Times New Roman"/>
-          <w:sz w:val="24"/>
-          <w:szCs w:val="24"/>
-        </w:rPr>
-      </w:pPr>
-      <w:r>
-        <w:rPr>
-          <w:rFonts w:ascii="Times New Roman" w:eastAsia="Times New Roman" w:hAnsi="Times New Roman" w:cs="Times New Roman"/>
+        <w:ind w:left="1080" w:hanging="360"/>
+        <w:jc w:val="both"/>
+        <w:rPr>
+          <w:rFonts w:ascii="Times New Roman" w:hAnsi="Times New Roman" w:eastAsia="Times New Roman" w:cs="Times New Roman"/>
+          <w:sz w:val="24"/>
+          <w:szCs w:val="24"/>
+        </w:rPr>
+      </w:pPr>
+      <w:r>
+        <w:rPr>
+          <w:rFonts w:ascii="Times New Roman" w:hAnsi="Times New Roman" w:eastAsia="Times New Roman" w:cs="Times New Roman"/>
           <w:b/>
           <w:bCs/>
           <w:sz w:val="24"/>
@@ -2408,7 +2287,7 @@
       </w:r>
       <w:r>
         <w:rPr>
-          <w:rFonts w:ascii="Times New Roman" w:eastAsia="Times New Roman" w:hAnsi="Times New Roman" w:cs="Times New Roman"/>
+          <w:rFonts w:ascii="Times New Roman" w:hAnsi="Times New Roman" w:eastAsia="Times New Roman" w:cs="Times New Roman"/>
           <w:sz w:val="24"/>
           <w:szCs w:val="24"/>
         </w:rPr>
@@ -2422,16 +2301,17 @@
           <w:numId w:val="19"/>
         </w:numPr>
         <w:spacing w:after="0" w:line="240" w:lineRule="auto"/>
-        <w:jc w:val="both"/>
-        <w:rPr>
-          <w:rFonts w:ascii="Times New Roman" w:eastAsia="Times New Roman" w:hAnsi="Times New Roman" w:cs="Times New Roman"/>
-          <w:sz w:val="24"/>
-          <w:szCs w:val="24"/>
-        </w:rPr>
-      </w:pPr>
-      <w:r>
-        <w:rPr>
-          <w:rFonts w:ascii="Times New Roman" w:eastAsia="Times New Roman" w:hAnsi="Times New Roman" w:cs="Times New Roman"/>
+        <w:ind w:left="1080" w:hanging="360"/>
+        <w:jc w:val="both"/>
+        <w:rPr>
+          <w:rFonts w:ascii="Times New Roman" w:hAnsi="Times New Roman" w:eastAsia="Times New Roman" w:cs="Times New Roman"/>
+          <w:sz w:val="24"/>
+          <w:szCs w:val="24"/>
+        </w:rPr>
+      </w:pPr>
+      <w:r>
+        <w:rPr>
+          <w:rFonts w:ascii="Times New Roman" w:hAnsi="Times New Roman" w:eastAsia="Times New Roman" w:cs="Times New Roman"/>
           <w:b/>
           <w:bCs/>
           <w:sz w:val="24"/>
@@ -2441,7 +2321,7 @@
       </w:r>
       <w:r>
         <w:rPr>
-          <w:rFonts w:ascii="Times New Roman" w:eastAsia="Times New Roman" w:hAnsi="Times New Roman" w:cs="Times New Roman"/>
+          <w:rFonts w:ascii="Times New Roman" w:hAnsi="Times New Roman" w:eastAsia="Times New Roman" w:cs="Times New Roman"/>
           <w:sz w:val="24"/>
           <w:szCs w:val="24"/>
         </w:rPr>
@@ -2455,16 +2335,17 @@
           <w:numId w:val="19"/>
         </w:numPr>
         <w:spacing w:after="0" w:line="240" w:lineRule="auto"/>
-        <w:jc w:val="both"/>
-        <w:rPr>
-          <w:rFonts w:ascii="Times New Roman" w:eastAsia="Times New Roman" w:hAnsi="Times New Roman" w:cs="Times New Roman"/>
-          <w:sz w:val="24"/>
-          <w:szCs w:val="24"/>
-        </w:rPr>
-      </w:pPr>
-      <w:r>
-        <w:rPr>
-          <w:rFonts w:ascii="Times New Roman" w:eastAsia="Times New Roman" w:hAnsi="Times New Roman" w:cs="Times New Roman"/>
+        <w:ind w:left="1080" w:hanging="360"/>
+        <w:jc w:val="both"/>
+        <w:rPr>
+          <w:rFonts w:ascii="Times New Roman" w:hAnsi="Times New Roman" w:eastAsia="Times New Roman" w:cs="Times New Roman"/>
+          <w:sz w:val="24"/>
+          <w:szCs w:val="24"/>
+        </w:rPr>
+      </w:pPr>
+      <w:r>
+        <w:rPr>
+          <w:rFonts w:ascii="Times New Roman" w:hAnsi="Times New Roman" w:eastAsia="Times New Roman" w:cs="Times New Roman"/>
           <w:b/>
           <w:bCs/>
           <w:sz w:val="24"/>
@@ -2474,7 +2355,7 @@
       </w:r>
       <w:r>
         <w:rPr>
-          <w:rFonts w:ascii="Times New Roman" w:eastAsia="Times New Roman" w:hAnsi="Times New Roman" w:cs="Times New Roman"/>
+          <w:rFonts w:ascii="Times New Roman" w:hAnsi="Times New Roman" w:eastAsia="Times New Roman" w:cs="Times New Roman"/>
           <w:sz w:val="24"/>
           <w:szCs w:val="24"/>
         </w:rPr>
@@ -2488,16 +2369,17 @@
           <w:numId w:val="19"/>
         </w:numPr>
         <w:spacing w:after="0" w:line="240" w:lineRule="auto"/>
-        <w:jc w:val="both"/>
-        <w:rPr>
-          <w:rFonts w:ascii="Times New Roman" w:eastAsia="Times New Roman" w:hAnsi="Times New Roman" w:cs="Times New Roman"/>
-          <w:sz w:val="24"/>
-          <w:szCs w:val="24"/>
-        </w:rPr>
-      </w:pPr>
-      <w:r>
-        <w:rPr>
-          <w:rFonts w:ascii="Times New Roman" w:eastAsia="Times New Roman" w:hAnsi="Times New Roman" w:cs="Times New Roman"/>
+        <w:ind w:left="1080" w:hanging="360"/>
+        <w:jc w:val="both"/>
+        <w:rPr>
+          <w:rFonts w:ascii="Times New Roman" w:hAnsi="Times New Roman" w:eastAsia="Times New Roman" w:cs="Times New Roman"/>
+          <w:sz w:val="24"/>
+          <w:szCs w:val="24"/>
+        </w:rPr>
+      </w:pPr>
+      <w:r>
+        <w:rPr>
+          <w:rFonts w:ascii="Times New Roman" w:hAnsi="Times New Roman" w:eastAsia="Times New Roman" w:cs="Times New Roman"/>
           <w:b/>
           <w:bCs/>
           <w:sz w:val="24"/>
@@ -2507,7 +2389,7 @@
       </w:r>
       <w:r>
         <w:rPr>
-          <w:rFonts w:ascii="Times New Roman" w:eastAsia="Times New Roman" w:hAnsi="Times New Roman" w:cs="Times New Roman"/>
+          <w:rFonts w:ascii="Times New Roman" w:hAnsi="Times New Roman" w:eastAsia="Times New Roman" w:cs="Times New Roman"/>
           <w:sz w:val="24"/>
           <w:szCs w:val="24"/>
         </w:rPr>
@@ -2521,16 +2403,17 @@
           <w:numId w:val="19"/>
         </w:numPr>
         <w:spacing w:after="0" w:line="240" w:lineRule="auto"/>
-        <w:jc w:val="both"/>
-        <w:rPr>
-          <w:rFonts w:ascii="Times New Roman" w:eastAsia="Times New Roman" w:hAnsi="Times New Roman" w:cs="Times New Roman"/>
-          <w:sz w:val="24"/>
-          <w:szCs w:val="24"/>
-        </w:rPr>
-      </w:pPr>
-      <w:r>
-        <w:rPr>
-          <w:rFonts w:ascii="Times New Roman" w:eastAsia="Times New Roman" w:hAnsi="Times New Roman" w:cs="Times New Roman"/>
+        <w:ind w:left="1080" w:hanging="360"/>
+        <w:jc w:val="both"/>
+        <w:rPr>
+          <w:rFonts w:ascii="Times New Roman" w:hAnsi="Times New Roman" w:eastAsia="Times New Roman" w:cs="Times New Roman"/>
+          <w:sz w:val="24"/>
+          <w:szCs w:val="24"/>
+        </w:rPr>
+      </w:pPr>
+      <w:r>
+        <w:rPr>
+          <w:rFonts w:ascii="Times New Roman" w:hAnsi="Times New Roman" w:eastAsia="Times New Roman" w:cs="Times New Roman"/>
           <w:b/>
           <w:bCs/>
           <w:sz w:val="24"/>
@@ -2540,7 +2423,7 @@
       </w:r>
       <w:r>
         <w:rPr>
-          <w:rFonts w:ascii="Times New Roman" w:eastAsia="Times New Roman" w:hAnsi="Times New Roman" w:cs="Times New Roman"/>
+          <w:rFonts w:ascii="Times New Roman" w:hAnsi="Times New Roman" w:eastAsia="Times New Roman" w:cs="Times New Roman"/>
           <w:sz w:val="24"/>
           <w:szCs w:val="24"/>
         </w:rPr>
@@ -2554,30 +2437,67 @@
           <w:numId w:val="19"/>
         </w:numPr>
         <w:spacing w:after="0" w:line="240" w:lineRule="auto"/>
-        <w:jc w:val="both"/>
-        <w:rPr>
-          <w:rFonts w:ascii="Times New Roman" w:eastAsia="Times New Roman" w:hAnsi="Times New Roman" w:cs="Times New Roman"/>
-          <w:sz w:val="24"/>
-          <w:szCs w:val="24"/>
-        </w:rPr>
-      </w:pPr>
-      <w:r>
-        <w:rPr>
-          <w:rFonts w:ascii="Times New Roman" w:eastAsia="Times New Roman" w:hAnsi="Times New Roman" w:cs="Times New Roman"/>
+        <w:ind w:left="1080" w:hanging="360"/>
+        <w:jc w:val="both"/>
+        <w:rPr>
+          <w:rFonts w:ascii="Times New Roman" w:hAnsi="Times New Roman" w:eastAsia="Times New Roman" w:cs="Times New Roman"/>
+          <w:sz w:val="24"/>
+          <w:szCs w:val="24"/>
+        </w:rPr>
+      </w:pPr>
+      <w:r>
+        <w:rPr>
+          <w:rFonts w:ascii="Times New Roman" w:hAnsi="Times New Roman" w:eastAsia="Times New Roman" w:cs="Times New Roman"/>
           <w:b/>
           <w:bCs/>
           <w:sz w:val="24"/>
           <w:szCs w:val="24"/>
         </w:rPr>
-        <w:t>Biaya di Semester VII + Sidang KP (Rp400.000)</w:t>
-      </w:r>
-      <w:r>
-        <w:rPr>
-          <w:rFonts w:ascii="Times New Roman" w:eastAsia="Times New Roman" w:hAnsi="Times New Roman" w:cs="Times New Roman"/>
-          <w:sz w:val="24"/>
-          <w:szCs w:val="24"/>
-        </w:rPr>
-        <w:t xml:space="preserve">: Rp3.400.000 </w:t>
+        <w:t>Biaya di Semester VII</w:t>
+      </w:r>
+      <w:r>
+        <w:rPr>
+          <w:rFonts w:ascii="Times New Roman" w:hAnsi="Times New Roman" w:eastAsia="Times New Roman" w:cs="Times New Roman"/>
+          <w:sz w:val="24"/>
+          <w:szCs w:val="24"/>
+        </w:rPr>
+        <w:t>:</w:t>
+      </w:r>
+      <w:r>
+        <w:rPr>
+          <w:rFonts w:ascii="Times New Roman" w:hAnsi="Times New Roman" w:eastAsia="Times New Roman" w:cs="Times New Roman"/>
+          <w:b/>
+          <w:bCs/>
+          <w:sz w:val="24"/>
+          <w:szCs w:val="24"/>
+        </w:rPr>
+        <w:t xml:space="preserve"> </w:t>
+      </w:r>
+      <w:r>
+        <w:rPr>
+          <w:rFonts w:ascii="Times New Roman" w:cs="Times New Roman"/>
+          <w:sz w:val="24"/>
+          <w:szCs w:val="24"/>
+        </w:rPr>
+        <w:t>Rp3.000.000</w:t>
+      </w:r>
+      <w:r>
+        <w:rPr>
+          <w:rFonts w:ascii="Times New Roman" w:hAnsi="Times New Roman" w:eastAsia="Times New Roman" w:cs="Times New Roman"/>
+          <w:b/>
+          <w:bCs/>
+          <w:sz w:val="24"/>
+          <w:szCs w:val="24"/>
+        </w:rPr>
+        <w:t xml:space="preserve"> + Sidang KP </w:t>
+      </w:r>
+      <w:r>
+        <w:rPr>
+          <w:rFonts w:ascii="Times New Roman" w:hAnsi="Times New Roman" w:eastAsia="Times New Roman" w:cs="Times New Roman"/>
+          <w:sz w:val="24"/>
+          <w:szCs w:val="24"/>
+        </w:rPr>
+        <w:t xml:space="preserve">Rp400.000 = Rp3.400.000 </w:t>
       </w:r>
     </w:p>
     <w:p>
@@ -2587,90 +2507,105 @@
           <w:numId w:val="19"/>
         </w:numPr>
         <w:spacing w:after="0" w:line="240" w:lineRule="auto"/>
-        <w:jc w:val="both"/>
-        <w:rPr>
-          <w:rFonts w:ascii="Times New Roman" w:eastAsia="Times New Roman" w:hAnsi="Times New Roman" w:cs="Times New Roman"/>
-          <w:sz w:val="24"/>
-          <w:szCs w:val="24"/>
-        </w:rPr>
-      </w:pPr>
-      <w:r>
-        <w:rPr>
-          <w:rFonts w:ascii="Times New Roman" w:eastAsia="Times New Roman" w:hAnsi="Times New Roman" w:cs="Times New Roman"/>
+        <w:ind w:left="1080" w:hanging="360"/>
+        <w:jc w:val="both"/>
+        <w:rPr>
+          <w:rFonts w:ascii="Times New Roman" w:hAnsi="Times New Roman" w:eastAsia="Times New Roman" w:cs="Times New Roman"/>
+          <w:sz w:val="24"/>
+          <w:szCs w:val="24"/>
+        </w:rPr>
+      </w:pPr>
+      <w:r>
+        <w:rPr>
+          <w:rFonts w:ascii="Times New Roman" w:hAnsi="Times New Roman" w:eastAsia="Times New Roman" w:cs="Times New Roman"/>
           <w:b/>
           <w:bCs/>
           <w:sz w:val="24"/>
           <w:szCs w:val="24"/>
         </w:rPr>
-        <w:t>Biaya di Semester VIII + Sidang TA &amp; Wisuda (Rp3.000.000)</w:t>
-      </w:r>
-      <w:r>
-        <w:rPr>
-          <w:rFonts w:ascii="Times New Roman" w:eastAsia="Times New Roman" w:hAnsi="Times New Roman" w:cs="Times New Roman"/>
-          <w:sz w:val="24"/>
-          <w:szCs w:val="24"/>
-        </w:rPr>
-        <w:t xml:space="preserve">: Rp6.000.000 </w:t>
-      </w:r>
-    </w:p>
-    <w:p>
-      <w:pPr>
-        <w:spacing w:after="0" w:line="240" w:lineRule="auto"/>
-        <w:ind w:left="720"/>
-        <w:jc w:val="both"/>
-        <w:rPr>
-          <w:rFonts w:ascii="Times New Roman" w:eastAsia="Times New Roman" w:hAnsi="Times New Roman" w:cs="Times New Roman"/>
-          <w:sz w:val="24"/>
-          <w:szCs w:val="24"/>
-        </w:rPr>
-      </w:pPr>
-    </w:p>
-    <w:p>
-      <w:pPr>
-        <w:spacing w:after="0" w:line="240" w:lineRule="auto"/>
-        <w:jc w:val="both"/>
-        <w:rPr>
-          <w:rFonts w:ascii="Times New Roman" w:eastAsia="Times New Roman" w:hAnsi="Times New Roman" w:cs="Times New Roman"/>
+        <w:t>Biaya di Semester VIII</w:t>
+      </w:r>
+      <w:r>
+        <w:rPr>
+          <w:rFonts w:ascii="Times New Roman" w:hAnsi="Times New Roman" w:eastAsia="Times New Roman" w:cs="Times New Roman"/>
+          <w:sz w:val="24"/>
+          <w:szCs w:val="24"/>
+        </w:rPr>
+        <w:t xml:space="preserve">: </w:t>
+      </w:r>
+      <w:r>
+        <w:rPr>
+          <w:rFonts w:ascii="Times New Roman" w:cs="Times New Roman"/>
+          <w:sz w:val="24"/>
+          <w:szCs w:val="24"/>
+        </w:rPr>
+        <w:t>Rp3.000.000</w:t>
+      </w:r>
+      <w:r>
+        <w:rPr>
+          <w:rFonts w:ascii="Times New Roman" w:hAnsi="Times New Roman" w:eastAsia="Times New Roman" w:cs="Times New Roman"/>
           <w:b/>
           <w:bCs/>
           <w:sz w:val="24"/>
           <w:szCs w:val="24"/>
         </w:rPr>
-      </w:pPr>
-      <w:r>
-        <w:rPr>
-          <w:rFonts w:ascii="Times New Roman" w:eastAsia="Times New Roman" w:hAnsi="Times New Roman" w:cs="Times New Roman"/>
+        <w:t xml:space="preserve"> + Sidang TA &amp; Wisuda </w:t>
+      </w:r>
+      <w:r>
+        <w:rPr>
+          <w:rFonts w:ascii="Times New Roman" w:hAnsi="Times New Roman" w:eastAsia="Times New Roman" w:cs="Times New Roman"/>
+          <w:sz w:val="24"/>
+          <w:szCs w:val="24"/>
+        </w:rPr>
+        <w:t>Rp3.000.000</w:t>
+      </w:r>
+      <w:r>
+        <w:rPr>
+          <w:rFonts w:ascii="Times New Roman" w:hAnsi="Times New Roman" w:eastAsia="Times New Roman" w:cs="Times New Roman"/>
           <w:b/>
           <w:bCs/>
           <w:sz w:val="24"/>
           <w:szCs w:val="24"/>
         </w:rPr>
-        <w:lastRenderedPageBreak/>
-        <w:t xml:space="preserve">Total Keseluruhan Biaya Kuliah dari Semester 1 sampai </w:t>
-      </w:r>
-      <w:r>
-        <w:rPr>
-          <w:rFonts w:ascii="Times New Roman" w:eastAsia="Times New Roman" w:hAnsi="Times New Roman" w:cs="Times New Roman"/>
+        <w:t xml:space="preserve"> </w:t>
+      </w:r>
+      <w:r>
+        <w:rPr>
+          <w:rFonts w:ascii="Times New Roman" w:hAnsi="Times New Roman" w:eastAsia="Times New Roman" w:cs="Times New Roman"/>
+          <w:sz w:val="24"/>
+          <w:szCs w:val="24"/>
+        </w:rPr>
+        <w:t xml:space="preserve">= Rp6.000.000 </w:t>
+      </w:r>
+    </w:p>
+    <w:p>
+      <w:pPr>
+        <w:numPr>
+          <w:ilvl w:val="0"/>
+          <w:numId w:val="19"/>
+        </w:numPr>
+        <w:spacing w:after="0" w:line="240" w:lineRule="auto"/>
+        <w:ind w:left="1080" w:hanging="360"/>
+        <w:jc w:val="both"/>
+        <w:rPr>
+          <w:rFonts w:ascii="Times New Roman" w:hAnsi="Times New Roman" w:eastAsia="Times New Roman" w:cs="Times New Roman"/>
+          <w:sz w:val="24"/>
+          <w:szCs w:val="24"/>
+        </w:rPr>
+      </w:pPr>
+      <w:r>
+        <w:rPr>
+          <w:rFonts w:ascii="Times New Roman" w:hAnsi="Times New Roman" w:eastAsia="Times New Roman" w:cs="Times New Roman"/>
           <w:b/>
           <w:bCs/>
           <w:sz w:val="24"/>
           <w:szCs w:val="24"/>
         </w:rPr>
-        <w:t xml:space="preserve">8 / Selesai / </w:t>
-      </w:r>
-      <w:r>
-        <w:rPr>
-          <w:rFonts w:ascii="Times New Roman" w:eastAsia="Times New Roman" w:hAnsi="Times New Roman" w:cs="Times New Roman"/>
-          <w:b/>
-          <w:bCs/>
-          <w:sz w:val="24"/>
-          <w:szCs w:val="24"/>
-        </w:rPr>
-        <w:t xml:space="preserve">Lulus adalah: </w:t>
-      </w:r>
-      <w:r>
-        <w:rPr>
-          <w:rFonts w:ascii="Times New Roman" w:eastAsia="Times New Roman" w:hAnsi="Times New Roman" w:cs="Times New Roman"/>
+        <w:t xml:space="preserve">Total Keseluruhan Biaya Kuliah dari Semester 1 sampai 8 adalah: </w:t>
+      </w:r>
+      <w:r>
+        <w:rPr>
+          <w:rFonts w:ascii="Times New Roman" w:hAnsi="Times New Roman" w:eastAsia="Times New Roman" w:cs="Times New Roman"/>
           <w:sz w:val="24"/>
           <w:szCs w:val="24"/>
         </w:rPr>
@@ -2680,7 +2615,6 @@
     <w:sectPr>
       <w:pgSz w:w="11906" w:h="16838"/>
       <w:pgMar w:top="1440" w:right="1440" w:bottom="1440" w:left="1440" w:header="708" w:footer="708" w:gutter="0"/>
-      <w:cols w:space="708"/>
       <w:docGrid w:linePitch="360"/>
     </w:sectPr>
   </w:body>

</xml_diff>

<commit_message>
update 1.4 (filter, update ingest)
</commit_message>
<xml_diff>
--- a/documents/PMB.docx
+++ b/documents/PMB.docx
@@ -471,24 +471,24 @@
         <w:spacing w:after="0" w:line="240" w:lineRule="auto"/>
         <w:jc w:val="both"/>
         <w:rPr>
-          <w:rFonts w:ascii="Times New Roman" w:eastAsia="Times New Roman" w:hAnsi="Times New Roman" w:cs="Times New Roman"/>
-          <w:sz w:val="24"/>
-          <w:szCs w:val="24"/>
-        </w:rPr>
-      </w:pPr>
-      <w:r>
-        <w:rPr>
-          <w:rFonts w:ascii="Times New Roman" w:eastAsia="Times New Roman" w:hAnsi="Times New Roman" w:cs="Times New Roman"/>
+          <w:rFonts w:ascii="Times New Roman" w:hAnsi="Times New Roman" w:eastAsia="Times New Roman" w:cs="Times New Roman"/>
+          <w:sz w:val="24"/>
+          <w:szCs w:val="24"/>
+        </w:rPr>
+      </w:pPr>
+      <w:r>
+        <w:rPr>
+          <w:rFonts w:ascii="Times New Roman" w:hAnsi="Times New Roman" w:eastAsia="Times New Roman" w:cs="Times New Roman"/>
           <w:b/>
           <w:bCs/>
           <w:sz w:val="24"/>
           <w:szCs w:val="24"/>
         </w:rPr>
-        <w:t>SEKILAS STT CIPASUNG</w:t>
-      </w:r>
-      <w:r>
-        <w:rPr>
-          <w:rFonts w:ascii="Times New Roman" w:eastAsia="Times New Roman" w:hAnsi="Times New Roman" w:cs="Times New Roman"/>
+        <w:t>SEKILAS TENTANG STT CIPASUNG</w:t>
+      </w:r>
+      <w:r>
+        <w:rPr>
+          <w:rFonts w:ascii="Times New Roman" w:hAnsi="Times New Roman" w:eastAsia="Times New Roman" w:cs="Times New Roman"/>
           <w:sz w:val="24"/>
           <w:szCs w:val="24"/>
         </w:rPr>

</xml_diff>

<commit_message>
update 1.4 (update kategori)
</commit_message>
<xml_diff>
--- a/documents/PMB.docx
+++ b/documents/PMB.docx
@@ -1747,24 +1747,24 @@
         <w:spacing w:after="0" w:line="240" w:lineRule="auto"/>
         <w:jc w:val="both"/>
         <w:rPr>
-          <w:rFonts w:ascii="Times New Roman" w:eastAsia="Times New Roman" w:hAnsi="Times New Roman" w:cs="Times New Roman"/>
-          <w:sz w:val="24"/>
-          <w:szCs w:val="24"/>
-        </w:rPr>
-      </w:pPr>
-      <w:r>
-        <w:rPr>
-          <w:rFonts w:ascii="Times New Roman" w:eastAsia="Times New Roman" w:hAnsi="Times New Roman" w:cs="Times New Roman"/>
+          <w:rFonts w:ascii="Times New Roman" w:hAnsi="Times New Roman" w:eastAsia="Times New Roman" w:cs="Times New Roman"/>
+          <w:sz w:val="24"/>
+          <w:szCs w:val="24"/>
+        </w:rPr>
+      </w:pPr>
+      <w:r>
+        <w:rPr>
+          <w:rFonts w:ascii="Times New Roman" w:hAnsi="Times New Roman" w:eastAsia="Times New Roman" w:cs="Times New Roman"/>
           <w:b/>
           <w:bCs/>
           <w:sz w:val="24"/>
           <w:szCs w:val="24"/>
         </w:rPr>
-        <w:t>PRODI TEKNIK INDUSTRI (TI)</w:t>
-      </w:r>
-      <w:r>
-        <w:rPr>
-          <w:rFonts w:ascii="Times New Roman" w:eastAsia="Times New Roman" w:hAnsi="Times New Roman" w:cs="Times New Roman"/>
+        <w:t>TENTANG PRODI TEKNIK INDUSTRI (TI)</w:t>
+      </w:r>
+      <w:r>
+        <w:rPr>
+          <w:rFonts w:ascii="Times New Roman" w:hAnsi="Times New Roman" w:eastAsia="Times New Roman" w:cs="Times New Roman"/>
           <w:sz w:val="24"/>
           <w:szCs w:val="24"/>
         </w:rPr>
@@ -4519,24 +4519,24 @@
         <w:spacing w:after="0" w:line="240" w:lineRule="auto"/>
         <w:jc w:val="both"/>
         <w:rPr>
-          <w:rFonts w:ascii="Times New Roman" w:eastAsia="Times New Roman" w:hAnsi="Times New Roman" w:cs="Times New Roman"/>
-          <w:sz w:val="24"/>
-          <w:szCs w:val="24"/>
-        </w:rPr>
-      </w:pPr>
-      <w:r>
-        <w:rPr>
-          <w:rFonts w:ascii="Times New Roman" w:eastAsia="Times New Roman" w:hAnsi="Times New Roman" w:cs="Times New Roman"/>
+          <w:rFonts w:ascii="Times New Roman" w:hAnsi="Times New Roman" w:eastAsia="Times New Roman" w:cs="Times New Roman"/>
+          <w:sz w:val="24"/>
+          <w:szCs w:val="24"/>
+        </w:rPr>
+      </w:pPr>
+      <w:r>
+        <w:rPr>
+          <w:rFonts w:ascii="Times New Roman" w:hAnsi="Times New Roman" w:eastAsia="Times New Roman" w:cs="Times New Roman"/>
           <w:b/>
           <w:bCs/>
           <w:sz w:val="24"/>
           <w:szCs w:val="24"/>
         </w:rPr>
-        <w:t>PRODI INFORMATIKA (IF)</w:t>
-      </w:r>
-      <w:r>
-        <w:rPr>
-          <w:rFonts w:ascii="Times New Roman" w:eastAsia="Times New Roman" w:hAnsi="Times New Roman" w:cs="Times New Roman"/>
+        <w:t>TENTANG PRODI INFORMATIKA (IF)</w:t>
+      </w:r>
+      <w:r>
+        <w:rPr>
+          <w:rFonts w:ascii="Times New Roman" w:hAnsi="Times New Roman" w:eastAsia="Times New Roman" w:cs="Times New Roman"/>
           <w:sz w:val="24"/>
           <w:szCs w:val="24"/>
         </w:rPr>

</xml_diff>